<commit_message>
Day 2 worksheet: include grammar and vocabulary
Co-Authored-By: Claude Sonnet 5.5 <noreply@anthropic.com>
Claude-Session: https://claude.ai/code/session_01H85nk5Q4NT7Z7YbSVEgRVr
</commit_message>
<xml_diff>
--- a/german/lessons/2026-10-27-uebungen.docx
+++ b/german/lessons/2026-10-27-uebungen.docx
@@ -15,7 +15,7 @@
           <w:sz w:val="36"/>
           <w:szCs w:val="36"/>
         </w:rPr>
-        <w:t xml:space="preserve">Deutsch A1→A2 · Tag 2 · Übungen</w:t>
+        <w:t xml:space="preserve">Deutsch A1→A2 · Tag 2 · Lektion und Übungen</w:t>
       </w:r>
     </w:p>
     <w:p>
@@ -43,6 +43,3588 @@
           <w:szCs w:val="24"/>
         </w:rPr>
         <w:t xml:space="preserve">Имя: ______________________________     Дата: ________________</w:t>
+      </w:r>
+    </w:p>
+    <w:p>
+      <w:pPr>
+        <w:keepNext/>
+        <w:pBdr>
+          <w:bottom w:val="single" w:color="1F3864" w:sz="6" w:space="2"/>
+        </w:pBdr>
+        <w:spacing w:after="120" w:before="300"/>
+      </w:pPr>
+      <w:r>
+        <w:rPr>
+          <w:rFonts w:ascii="Arial" w:cs="Arial" w:eastAsia="Arial" w:hAnsi="Arial"/>
+          <w:b/>
+          <w:bCs/>
+          <w:color w:val="1F3864"/>
+          <w:sz w:val="28"/>
+          <w:szCs w:val="28"/>
+        </w:rPr>
+        <w:t xml:space="preserve">Грамматика</w:t>
+      </w:r>
+    </w:p>
+    <w:p>
+      <w:pPr>
+        <w:keepNext/>
+        <w:spacing w:after="80" w:before="0"/>
+      </w:pPr>
+      <w:r>
+        <w:rPr>
+          <w:rFonts w:ascii="Arial" w:cs="Arial" w:eastAsia="Arial" w:hAnsi="Arial"/>
+          <w:b/>
+          <w:bCs/>
+          <w:sz w:val="24"/>
+          <w:szCs w:val="24"/>
+        </w:rPr>
+        <w:t xml:space="preserve">1. Личные местоимения</w:t>
+      </w:r>
+    </w:p>
+    <w:tbl>
+      <w:tblPr>
+        <w:tblW w:type="dxa" w:w="9638"/>
+        <w:tblBorders>
+          <w:top w:val="single" w:color="auto" w:sz="4"/>
+          <w:left w:val="single" w:color="auto" w:sz="4"/>
+          <w:bottom w:val="single" w:color="auto" w:sz="4"/>
+          <w:right w:val="single" w:color="auto" w:sz="4"/>
+          <w:insideH w:val="single" w:color="auto" w:sz="4"/>
+          <w:insideV w:val="single" w:color="auto" w:sz="4"/>
+        </w:tblBorders>
+      </w:tblPr>
+      <w:tblGrid>
+        <w:gridCol w:w="2000"/>
+        <w:gridCol w:w="3800"/>
+        <w:gridCol w:w="3838"/>
+      </w:tblGrid>
+      <w:tr>
+        <w:trPr>
+          <w:tblHeader/>
+        </w:trPr>
+        <w:tc>
+          <w:tcPr>
+            <w:tcW w:type="dxa" w:w="2000"/>
+            <w:tcBorders>
+              <w:top w:val="single" w:color="999999" w:sz="4"/>
+              <w:left w:val="single" w:color="999999" w:sz="4"/>
+              <w:bottom w:val="single" w:color="999999" w:sz="4"/>
+              <w:right w:val="single" w:color="999999" w:sz="4"/>
+            </w:tcBorders>
+            <w:shd w:fill="E7ECF5" w:color="auto" w:val="clear"/>
+            <w:tcMar>
+              <w:top w:type="dxa" w:w="80"/>
+              <w:left w:type="dxa" w:w="100"/>
+              <w:bottom w:type="dxa" w:w="80"/>
+              <w:right w:type="dxa" w:w="100"/>
+            </w:tcMar>
+          </w:tcPr>
+          <w:p>
+            <w:pPr>
+              <w:spacing w:after="0" w:before="0"/>
+            </w:pPr>
+            <w:r>
+              <w:rPr>
+                <w:rFonts w:ascii="Arial" w:cs="Arial" w:eastAsia="Arial" w:hAnsi="Arial"/>
+                <w:b/>
+                <w:bCs/>
+                <w:sz w:val="22"/>
+                <w:szCs w:val="22"/>
+              </w:rPr>
+              <w:t xml:space="preserve"/>
+            </w:r>
+          </w:p>
+        </w:tc>
+        <w:tc>
+          <w:tcPr>
+            <w:tcW w:type="dxa" w:w="3800"/>
+            <w:tcBorders>
+              <w:top w:val="single" w:color="999999" w:sz="4"/>
+              <w:left w:val="single" w:color="999999" w:sz="4"/>
+              <w:bottom w:val="single" w:color="999999" w:sz="4"/>
+              <w:right w:val="single" w:color="999999" w:sz="4"/>
+            </w:tcBorders>
+            <w:shd w:fill="E7ECF5" w:color="auto" w:val="clear"/>
+            <w:tcMar>
+              <w:top w:type="dxa" w:w="80"/>
+              <w:left w:type="dxa" w:w="100"/>
+              <w:bottom w:type="dxa" w:w="80"/>
+              <w:right w:type="dxa" w:w="100"/>
+            </w:tcMar>
+          </w:tcPr>
+          <w:p>
+            <w:pPr>
+              <w:spacing w:after="0" w:before="0"/>
+            </w:pPr>
+            <w:r>
+              <w:rPr>
+                <w:rFonts w:ascii="Arial" w:cs="Arial" w:eastAsia="Arial" w:hAnsi="Arial"/>
+                <w:b/>
+                <w:bCs/>
+                <w:sz w:val="22"/>
+                <w:szCs w:val="22"/>
+              </w:rPr>
+              <w:t xml:space="preserve">Единственное число</w:t>
+            </w:r>
+          </w:p>
+        </w:tc>
+        <w:tc>
+          <w:tcPr>
+            <w:tcW w:type="dxa" w:w="3838"/>
+            <w:tcBorders>
+              <w:top w:val="single" w:color="999999" w:sz="4"/>
+              <w:left w:val="single" w:color="999999" w:sz="4"/>
+              <w:bottom w:val="single" w:color="999999" w:sz="4"/>
+              <w:right w:val="single" w:color="999999" w:sz="4"/>
+            </w:tcBorders>
+            <w:shd w:fill="E7ECF5" w:color="auto" w:val="clear"/>
+            <w:tcMar>
+              <w:top w:type="dxa" w:w="80"/>
+              <w:left w:type="dxa" w:w="100"/>
+              <w:bottom w:type="dxa" w:w="80"/>
+              <w:right w:type="dxa" w:w="100"/>
+            </w:tcMar>
+          </w:tcPr>
+          <w:p>
+            <w:pPr>
+              <w:spacing w:after="0" w:before="0"/>
+            </w:pPr>
+            <w:r>
+              <w:rPr>
+                <w:rFonts w:ascii="Arial" w:cs="Arial" w:eastAsia="Arial" w:hAnsi="Arial"/>
+                <w:b/>
+                <w:bCs/>
+                <w:sz w:val="22"/>
+                <w:szCs w:val="22"/>
+              </w:rPr>
+              <w:t xml:space="preserve">Множественное число</w:t>
+            </w:r>
+          </w:p>
+        </w:tc>
+      </w:tr>
+      <w:tr>
+        <w:trPr>
+          <w:tblHeader w:val="false"/>
+        </w:trPr>
+        <w:tc>
+          <w:tcPr>
+            <w:tcW w:type="dxa" w:w="2000"/>
+            <w:tcBorders>
+              <w:top w:val="single" w:color="999999" w:sz="4"/>
+              <w:left w:val="single" w:color="999999" w:sz="4"/>
+              <w:bottom w:val="single" w:color="999999" w:sz="4"/>
+              <w:right w:val="single" w:color="999999" w:sz="4"/>
+            </w:tcBorders>
+            <w:shd w:fill="F7F7F7" w:color="auto" w:val="clear"/>
+            <w:tcMar>
+              <w:top w:type="dxa" w:w="80"/>
+              <w:left w:type="dxa" w:w="100"/>
+              <w:bottom w:type="dxa" w:w="80"/>
+              <w:right w:type="dxa" w:w="100"/>
+            </w:tcMar>
+          </w:tcPr>
+          <w:p>
+            <w:pPr>
+              <w:spacing w:after="0" w:before="0"/>
+            </w:pPr>
+            <w:r>
+              <w:rPr>
+                <w:rFonts w:ascii="Arial" w:cs="Arial" w:eastAsia="Arial" w:hAnsi="Arial"/>
+                <w:b/>
+                <w:bCs/>
+                <w:sz w:val="22"/>
+                <w:szCs w:val="22"/>
+              </w:rPr>
+              <w:t xml:space="preserve">1-е лицо</w:t>
+            </w:r>
+          </w:p>
+        </w:tc>
+        <w:tc>
+          <w:tcPr>
+            <w:tcW w:type="dxa" w:w="3800"/>
+            <w:tcBorders>
+              <w:top w:val="single" w:color="999999" w:sz="4"/>
+              <w:left w:val="single" w:color="999999" w:sz="4"/>
+              <w:bottom w:val="single" w:color="999999" w:sz="4"/>
+              <w:right w:val="single" w:color="999999" w:sz="4"/>
+            </w:tcBorders>
+            <w:tcMar>
+              <w:top w:type="dxa" w:w="80"/>
+              <w:left w:type="dxa" w:w="100"/>
+              <w:bottom w:type="dxa" w:w="80"/>
+              <w:right w:type="dxa" w:w="100"/>
+            </w:tcMar>
+          </w:tcPr>
+          <w:p>
+            <w:pPr>
+              <w:spacing w:after="0" w:before="0"/>
+            </w:pPr>
+            <w:r>
+              <w:rPr>
+                <w:rFonts w:ascii="Arial" w:cs="Arial" w:eastAsia="Arial" w:hAnsi="Arial"/>
+                <w:b w:val="false"/>
+                <w:bCs w:val="false"/>
+                <w:sz w:val="22"/>
+                <w:szCs w:val="22"/>
+              </w:rPr>
+              <w:t xml:space="preserve">ich — я</w:t>
+            </w:r>
+          </w:p>
+        </w:tc>
+        <w:tc>
+          <w:tcPr>
+            <w:tcW w:type="dxa" w:w="3838"/>
+            <w:tcBorders>
+              <w:top w:val="single" w:color="999999" w:sz="4"/>
+              <w:left w:val="single" w:color="999999" w:sz="4"/>
+              <w:bottom w:val="single" w:color="999999" w:sz="4"/>
+              <w:right w:val="single" w:color="999999" w:sz="4"/>
+            </w:tcBorders>
+            <w:tcMar>
+              <w:top w:type="dxa" w:w="80"/>
+              <w:left w:type="dxa" w:w="100"/>
+              <w:bottom w:type="dxa" w:w="80"/>
+              <w:right w:type="dxa" w:w="100"/>
+            </w:tcMar>
+          </w:tcPr>
+          <w:p>
+            <w:pPr>
+              <w:spacing w:after="0" w:before="0"/>
+            </w:pPr>
+            <w:r>
+              <w:rPr>
+                <w:rFonts w:ascii="Arial" w:cs="Arial" w:eastAsia="Arial" w:hAnsi="Arial"/>
+                <w:b w:val="false"/>
+                <w:bCs w:val="false"/>
+                <w:sz w:val="22"/>
+                <w:szCs w:val="22"/>
+              </w:rPr>
+              <w:t xml:space="preserve">wir — мы</w:t>
+            </w:r>
+          </w:p>
+        </w:tc>
+      </w:tr>
+      <w:tr>
+        <w:trPr>
+          <w:tblHeader w:val="false"/>
+        </w:trPr>
+        <w:tc>
+          <w:tcPr>
+            <w:tcW w:type="dxa" w:w="2000"/>
+            <w:tcBorders>
+              <w:top w:val="single" w:color="999999" w:sz="4"/>
+              <w:left w:val="single" w:color="999999" w:sz="4"/>
+              <w:bottom w:val="single" w:color="999999" w:sz="4"/>
+              <w:right w:val="single" w:color="999999" w:sz="4"/>
+            </w:tcBorders>
+            <w:shd w:fill="F7F7F7" w:color="auto" w:val="clear"/>
+            <w:tcMar>
+              <w:top w:type="dxa" w:w="80"/>
+              <w:left w:type="dxa" w:w="100"/>
+              <w:bottom w:type="dxa" w:w="80"/>
+              <w:right w:type="dxa" w:w="100"/>
+            </w:tcMar>
+          </w:tcPr>
+          <w:p>
+            <w:pPr>
+              <w:spacing w:after="0" w:before="0"/>
+            </w:pPr>
+            <w:r>
+              <w:rPr>
+                <w:rFonts w:ascii="Arial" w:cs="Arial" w:eastAsia="Arial" w:hAnsi="Arial"/>
+                <w:b/>
+                <w:bCs/>
+                <w:sz w:val="22"/>
+                <w:szCs w:val="22"/>
+              </w:rPr>
+              <w:t xml:space="preserve">2-е лицо</w:t>
+            </w:r>
+          </w:p>
+        </w:tc>
+        <w:tc>
+          <w:tcPr>
+            <w:tcW w:type="dxa" w:w="3800"/>
+            <w:tcBorders>
+              <w:top w:val="single" w:color="999999" w:sz="4"/>
+              <w:left w:val="single" w:color="999999" w:sz="4"/>
+              <w:bottom w:val="single" w:color="999999" w:sz="4"/>
+              <w:right w:val="single" w:color="999999" w:sz="4"/>
+            </w:tcBorders>
+            <w:tcMar>
+              <w:top w:type="dxa" w:w="80"/>
+              <w:left w:type="dxa" w:w="100"/>
+              <w:bottom w:type="dxa" w:w="80"/>
+              <w:right w:type="dxa" w:w="100"/>
+            </w:tcMar>
+          </w:tcPr>
+          <w:p>
+            <w:pPr>
+              <w:spacing w:after="0" w:before="0"/>
+            </w:pPr>
+            <w:r>
+              <w:rPr>
+                <w:rFonts w:ascii="Arial" w:cs="Arial" w:eastAsia="Arial" w:hAnsi="Arial"/>
+                <w:b w:val="false"/>
+                <w:bCs w:val="false"/>
+                <w:sz w:val="22"/>
+                <w:szCs w:val="22"/>
+              </w:rPr>
+              <w:t xml:space="preserve">du — ты</w:t>
+            </w:r>
+          </w:p>
+        </w:tc>
+        <w:tc>
+          <w:tcPr>
+            <w:tcW w:type="dxa" w:w="3838"/>
+            <w:tcBorders>
+              <w:top w:val="single" w:color="999999" w:sz="4"/>
+              <w:left w:val="single" w:color="999999" w:sz="4"/>
+              <w:bottom w:val="single" w:color="999999" w:sz="4"/>
+              <w:right w:val="single" w:color="999999" w:sz="4"/>
+            </w:tcBorders>
+            <w:tcMar>
+              <w:top w:type="dxa" w:w="80"/>
+              <w:left w:type="dxa" w:w="100"/>
+              <w:bottom w:type="dxa" w:w="80"/>
+              <w:right w:type="dxa" w:w="100"/>
+            </w:tcMar>
+          </w:tcPr>
+          <w:p>
+            <w:pPr>
+              <w:spacing w:after="0" w:before="0"/>
+            </w:pPr>
+            <w:r>
+              <w:rPr>
+                <w:rFonts w:ascii="Arial" w:cs="Arial" w:eastAsia="Arial" w:hAnsi="Arial"/>
+                <w:b w:val="false"/>
+                <w:bCs w:val="false"/>
+                <w:sz w:val="22"/>
+                <w:szCs w:val="22"/>
+              </w:rPr>
+              <w:t xml:space="preserve">ihr — вы (несколько знакомых)</w:t>
+            </w:r>
+          </w:p>
+        </w:tc>
+      </w:tr>
+      <w:tr>
+        <w:trPr>
+          <w:tblHeader w:val="false"/>
+        </w:trPr>
+        <w:tc>
+          <w:tcPr>
+            <w:tcW w:type="dxa" w:w="2000"/>
+            <w:tcBorders>
+              <w:top w:val="single" w:color="999999" w:sz="4"/>
+              <w:left w:val="single" w:color="999999" w:sz="4"/>
+              <w:bottom w:val="single" w:color="999999" w:sz="4"/>
+              <w:right w:val="single" w:color="999999" w:sz="4"/>
+            </w:tcBorders>
+            <w:shd w:fill="F7F7F7" w:color="auto" w:val="clear"/>
+            <w:tcMar>
+              <w:top w:type="dxa" w:w="80"/>
+              <w:left w:type="dxa" w:w="100"/>
+              <w:bottom w:type="dxa" w:w="80"/>
+              <w:right w:type="dxa" w:w="100"/>
+            </w:tcMar>
+          </w:tcPr>
+          <w:p>
+            <w:pPr>
+              <w:spacing w:after="0" w:before="0"/>
+            </w:pPr>
+            <w:r>
+              <w:rPr>
+                <w:rFonts w:ascii="Arial" w:cs="Arial" w:eastAsia="Arial" w:hAnsi="Arial"/>
+                <w:b/>
+                <w:bCs/>
+                <w:sz w:val="22"/>
+                <w:szCs w:val="22"/>
+              </w:rPr>
+              <w:t xml:space="preserve">3-е лицо</w:t>
+            </w:r>
+          </w:p>
+        </w:tc>
+        <w:tc>
+          <w:tcPr>
+            <w:tcW w:type="dxa" w:w="3800"/>
+            <w:tcBorders>
+              <w:top w:val="single" w:color="999999" w:sz="4"/>
+              <w:left w:val="single" w:color="999999" w:sz="4"/>
+              <w:bottom w:val="single" w:color="999999" w:sz="4"/>
+              <w:right w:val="single" w:color="999999" w:sz="4"/>
+            </w:tcBorders>
+            <w:tcMar>
+              <w:top w:type="dxa" w:w="80"/>
+              <w:left w:type="dxa" w:w="100"/>
+              <w:bottom w:type="dxa" w:w="80"/>
+              <w:right w:type="dxa" w:w="100"/>
+            </w:tcMar>
+          </w:tcPr>
+          <w:p>
+            <w:pPr>
+              <w:spacing w:after="0" w:before="0"/>
+            </w:pPr>
+            <w:r>
+              <w:rPr>
+                <w:rFonts w:ascii="Arial" w:cs="Arial" w:eastAsia="Arial" w:hAnsi="Arial"/>
+                <w:b w:val="false"/>
+                <w:bCs w:val="false"/>
+                <w:sz w:val="22"/>
+                <w:szCs w:val="22"/>
+              </w:rPr>
+              <w:t xml:space="preserve">er — он · sie — она · es — оно</w:t>
+            </w:r>
+          </w:p>
+        </w:tc>
+        <w:tc>
+          <w:tcPr>
+            <w:tcW w:type="dxa" w:w="3838"/>
+            <w:tcBorders>
+              <w:top w:val="single" w:color="999999" w:sz="4"/>
+              <w:left w:val="single" w:color="999999" w:sz="4"/>
+              <w:bottom w:val="single" w:color="999999" w:sz="4"/>
+              <w:right w:val="single" w:color="999999" w:sz="4"/>
+            </w:tcBorders>
+            <w:tcMar>
+              <w:top w:type="dxa" w:w="80"/>
+              <w:left w:type="dxa" w:w="100"/>
+              <w:bottom w:type="dxa" w:w="80"/>
+              <w:right w:type="dxa" w:w="100"/>
+            </w:tcMar>
+          </w:tcPr>
+          <w:p>
+            <w:pPr>
+              <w:spacing w:after="0" w:before="0"/>
+            </w:pPr>
+            <w:r>
+              <w:rPr>
+                <w:rFonts w:ascii="Arial" w:cs="Arial" w:eastAsia="Arial" w:hAnsi="Arial"/>
+                <w:b w:val="false"/>
+                <w:bCs w:val="false"/>
+                <w:sz w:val="22"/>
+                <w:szCs w:val="22"/>
+              </w:rPr>
+              <w:t xml:space="preserve">sie — они</w:t>
+            </w:r>
+          </w:p>
+        </w:tc>
+      </w:tr>
+      <w:tr>
+        <w:trPr>
+          <w:tblHeader w:val="false"/>
+        </w:trPr>
+        <w:tc>
+          <w:tcPr>
+            <w:tcW w:type="dxa" w:w="2000"/>
+            <w:tcBorders>
+              <w:top w:val="single" w:color="999999" w:sz="4"/>
+              <w:left w:val="single" w:color="999999" w:sz="4"/>
+              <w:bottom w:val="single" w:color="999999" w:sz="4"/>
+              <w:right w:val="single" w:color="999999" w:sz="4"/>
+            </w:tcBorders>
+            <w:shd w:fill="F7F7F7" w:color="auto" w:val="clear"/>
+            <w:tcMar>
+              <w:top w:type="dxa" w:w="80"/>
+              <w:left w:type="dxa" w:w="100"/>
+              <w:bottom w:type="dxa" w:w="80"/>
+              <w:right w:type="dxa" w:w="100"/>
+            </w:tcMar>
+          </w:tcPr>
+          <w:p>
+            <w:pPr>
+              <w:spacing w:after="0" w:before="0"/>
+            </w:pPr>
+            <w:r>
+              <w:rPr>
+                <w:rFonts w:ascii="Arial" w:cs="Arial" w:eastAsia="Arial" w:hAnsi="Arial"/>
+                <w:b/>
+                <w:bCs/>
+                <w:sz w:val="22"/>
+                <w:szCs w:val="22"/>
+              </w:rPr>
+              <w:t xml:space="preserve">вежливое</w:t>
+            </w:r>
+          </w:p>
+        </w:tc>
+        <w:tc>
+          <w:tcPr>
+            <w:tcW w:type="dxa" w:w="3800"/>
+            <w:tcBorders>
+              <w:top w:val="single" w:color="999999" w:sz="4"/>
+              <w:left w:val="single" w:color="999999" w:sz="4"/>
+              <w:bottom w:val="single" w:color="999999" w:sz="4"/>
+              <w:right w:val="single" w:color="999999" w:sz="4"/>
+            </w:tcBorders>
+            <w:tcMar>
+              <w:top w:type="dxa" w:w="80"/>
+              <w:left w:type="dxa" w:w="100"/>
+              <w:bottom w:type="dxa" w:w="80"/>
+              <w:right w:type="dxa" w:w="100"/>
+            </w:tcMar>
+          </w:tcPr>
+          <w:p>
+            <w:pPr>
+              <w:spacing w:after="0" w:before="0"/>
+            </w:pPr>
+            <w:r>
+              <w:rPr>
+                <w:rFonts w:ascii="Arial" w:cs="Arial" w:eastAsia="Arial" w:hAnsi="Arial"/>
+                <w:b w:val="false"/>
+                <w:bCs w:val="false"/>
+                <w:sz w:val="22"/>
+                <w:szCs w:val="22"/>
+              </w:rPr>
+              <w:t xml:space="preserve">Sie — Вы (всегда с большой буквы)</w:t>
+            </w:r>
+          </w:p>
+        </w:tc>
+        <w:tc>
+          <w:tcPr>
+            <w:tcW w:type="dxa" w:w="3838"/>
+            <w:tcBorders>
+              <w:top w:val="single" w:color="999999" w:sz="4"/>
+              <w:left w:val="single" w:color="999999" w:sz="4"/>
+              <w:bottom w:val="single" w:color="999999" w:sz="4"/>
+              <w:right w:val="single" w:color="999999" w:sz="4"/>
+            </w:tcBorders>
+            <w:tcMar>
+              <w:top w:type="dxa" w:w="80"/>
+              <w:left w:type="dxa" w:w="100"/>
+              <w:bottom w:type="dxa" w:w="80"/>
+              <w:right w:type="dxa" w:w="100"/>
+            </w:tcMar>
+          </w:tcPr>
+          <w:p>
+            <w:pPr>
+              <w:spacing w:after="0" w:before="0"/>
+            </w:pPr>
+            <w:r>
+              <w:rPr>
+                <w:rFonts w:ascii="Arial" w:cs="Arial" w:eastAsia="Arial" w:hAnsi="Arial"/>
+                <w:b w:val="false"/>
+                <w:bCs w:val="false"/>
+                <w:sz w:val="22"/>
+                <w:szCs w:val="22"/>
+              </w:rPr>
+              <w:t xml:space="preserve"/>
+            </w:r>
+          </w:p>
+        </w:tc>
+      </w:tr>
+    </w:tbl>
+    <w:p>
+      <w:pPr>
+        <w:spacing w:after="120" w:before="100"/>
+      </w:pPr>
+      <w:r>
+        <w:rPr>
+          <w:rFonts w:ascii="Arial" w:cs="Arial" w:eastAsia="Arial" w:hAnsi="Arial"/>
+          <w:sz w:val="22"/>
+          <w:szCs w:val="22"/>
+        </w:rPr>
+        <w:t xml:space="preserve">⚠ sie (она) · sie (они) · Sie (Вы) пишутся одинаково. Различаем по глаголу: sie kommt — она, sie kommen — они, Sie kommen — Вы.</w:t>
+      </w:r>
+    </w:p>
+    <w:p>
+      <w:pPr>
+        <w:keepNext/>
+        <w:spacing w:after="80" w:before="160"/>
+      </w:pPr>
+      <w:r>
+        <w:rPr>
+          <w:rFonts w:ascii="Arial" w:cs="Arial" w:eastAsia="Arial" w:hAnsi="Arial"/>
+          <w:b/>
+          <w:bCs/>
+          <w:sz w:val="24"/>
+          <w:szCs w:val="24"/>
+        </w:rPr>
+        <w:t xml:space="preserve">2. Спряжение правильных глаголов (Präsens)</w:t>
+      </w:r>
+    </w:p>
+    <w:p>
+      <w:pPr>
+        <w:spacing w:after="80" w:before="0"/>
+      </w:pPr>
+      <w:r>
+        <w:rPr>
+          <w:rFonts w:ascii="Arial" w:cs="Arial" w:eastAsia="Arial" w:hAnsi="Arial"/>
+          <w:sz w:val="24"/>
+          <w:szCs w:val="24"/>
+        </w:rPr>
+        <w:t xml:space="preserve">Берём основу (инфинитив без -en) и добавляем окончание:</w:t>
+      </w:r>
+    </w:p>
+    <w:tbl>
+      <w:tblPr>
+        <w:tblW w:type="dxa" w:w="9638"/>
+        <w:tblBorders>
+          <w:top w:val="single" w:color="auto" w:sz="4"/>
+          <w:left w:val="single" w:color="auto" w:sz="4"/>
+          <w:bottom w:val="single" w:color="auto" w:sz="4"/>
+          <w:right w:val="single" w:color="auto" w:sz="4"/>
+          <w:insideH w:val="single" w:color="auto" w:sz="4"/>
+          <w:insideV w:val="single" w:color="auto" w:sz="4"/>
+        </w:tblBorders>
+      </w:tblPr>
+      <w:tblGrid>
+        <w:gridCol w:w="2400"/>
+        <w:gridCol w:w="3600"/>
+        <w:gridCol w:w="3638"/>
+      </w:tblGrid>
+      <w:tr>
+        <w:trPr>
+          <w:tblHeader/>
+        </w:trPr>
+        <w:tc>
+          <w:tcPr>
+            <w:tcW w:type="dxa" w:w="2400"/>
+            <w:tcBorders>
+              <w:top w:val="single" w:color="999999" w:sz="4"/>
+              <w:left w:val="single" w:color="999999" w:sz="4"/>
+              <w:bottom w:val="single" w:color="999999" w:sz="4"/>
+              <w:right w:val="single" w:color="999999" w:sz="4"/>
+            </w:tcBorders>
+            <w:shd w:fill="E7ECF5" w:color="auto" w:val="clear"/>
+            <w:tcMar>
+              <w:top w:type="dxa" w:w="80"/>
+              <w:left w:type="dxa" w:w="100"/>
+              <w:bottom w:type="dxa" w:w="80"/>
+              <w:right w:type="dxa" w:w="100"/>
+            </w:tcMar>
+          </w:tcPr>
+          <w:p>
+            <w:pPr>
+              <w:spacing w:after="0" w:before="0"/>
+            </w:pPr>
+            <w:r>
+              <w:rPr>
+                <w:rFonts w:ascii="Arial" w:cs="Arial" w:eastAsia="Arial" w:hAnsi="Arial"/>
+                <w:b/>
+                <w:bCs/>
+                <w:sz w:val="22"/>
+                <w:szCs w:val="22"/>
+              </w:rPr>
+              <w:t xml:space="preserve"/>
+            </w:r>
+          </w:p>
+        </w:tc>
+        <w:tc>
+          <w:tcPr>
+            <w:tcW w:type="dxa" w:w="3600"/>
+            <w:tcBorders>
+              <w:top w:val="single" w:color="999999" w:sz="4"/>
+              <w:left w:val="single" w:color="999999" w:sz="4"/>
+              <w:bottom w:val="single" w:color="999999" w:sz="4"/>
+              <w:right w:val="single" w:color="999999" w:sz="4"/>
+            </w:tcBorders>
+            <w:shd w:fill="E7ECF5" w:color="auto" w:val="clear"/>
+            <w:tcMar>
+              <w:top w:type="dxa" w:w="80"/>
+              <w:left w:type="dxa" w:w="100"/>
+              <w:bottom w:type="dxa" w:w="80"/>
+              <w:right w:type="dxa" w:w="100"/>
+            </w:tcMar>
+          </w:tcPr>
+          <w:p>
+            <w:pPr>
+              <w:spacing w:after="0" w:before="0"/>
+            </w:pPr>
+            <w:r>
+              <w:rPr>
+                <w:rFonts w:ascii="Arial" w:cs="Arial" w:eastAsia="Arial" w:hAnsi="Arial"/>
+                <w:b/>
+                <w:bCs/>
+                <w:sz w:val="22"/>
+                <w:szCs w:val="22"/>
+              </w:rPr>
+              <w:t xml:space="preserve">wohnen (основа wohn-)</w:t>
+            </w:r>
+          </w:p>
+        </w:tc>
+        <w:tc>
+          <w:tcPr>
+            <w:tcW w:type="dxa" w:w="3638"/>
+            <w:tcBorders>
+              <w:top w:val="single" w:color="999999" w:sz="4"/>
+              <w:left w:val="single" w:color="999999" w:sz="4"/>
+              <w:bottom w:val="single" w:color="999999" w:sz="4"/>
+              <w:right w:val="single" w:color="999999" w:sz="4"/>
+            </w:tcBorders>
+            <w:shd w:fill="E7ECF5" w:color="auto" w:val="clear"/>
+            <w:tcMar>
+              <w:top w:type="dxa" w:w="80"/>
+              <w:left w:type="dxa" w:w="100"/>
+              <w:bottom w:type="dxa" w:w="80"/>
+              <w:right w:type="dxa" w:w="100"/>
+            </w:tcMar>
+          </w:tcPr>
+          <w:p>
+            <w:pPr>
+              <w:spacing w:after="0" w:before="0"/>
+            </w:pPr>
+            <w:r>
+              <w:rPr>
+                <w:rFonts w:ascii="Arial" w:cs="Arial" w:eastAsia="Arial" w:hAnsi="Arial"/>
+                <w:b/>
+                <w:bCs/>
+                <w:sz w:val="22"/>
+                <w:szCs w:val="22"/>
+              </w:rPr>
+              <w:t xml:space="preserve">окончание</w:t>
+            </w:r>
+          </w:p>
+        </w:tc>
+      </w:tr>
+      <w:tr>
+        <w:trPr>
+          <w:tblHeader w:val="false"/>
+        </w:trPr>
+        <w:tc>
+          <w:tcPr>
+            <w:tcW w:type="dxa" w:w="2400"/>
+            <w:tcBorders>
+              <w:top w:val="single" w:color="999999" w:sz="4"/>
+              <w:left w:val="single" w:color="999999" w:sz="4"/>
+              <w:bottom w:val="single" w:color="999999" w:sz="4"/>
+              <w:right w:val="single" w:color="999999" w:sz="4"/>
+            </w:tcBorders>
+            <w:shd w:fill="F7F7F7" w:color="auto" w:val="clear"/>
+            <w:tcMar>
+              <w:top w:type="dxa" w:w="80"/>
+              <w:left w:type="dxa" w:w="100"/>
+              <w:bottom w:type="dxa" w:w="80"/>
+              <w:right w:type="dxa" w:w="100"/>
+            </w:tcMar>
+          </w:tcPr>
+          <w:p>
+            <w:pPr>
+              <w:spacing w:after="0" w:before="0"/>
+            </w:pPr>
+            <w:r>
+              <w:rPr>
+                <w:rFonts w:ascii="Arial" w:cs="Arial" w:eastAsia="Arial" w:hAnsi="Arial"/>
+                <w:b/>
+                <w:bCs/>
+                <w:sz w:val="22"/>
+                <w:szCs w:val="22"/>
+              </w:rPr>
+              <w:t xml:space="preserve">ich</w:t>
+            </w:r>
+          </w:p>
+        </w:tc>
+        <w:tc>
+          <w:tcPr>
+            <w:tcW w:type="dxa" w:w="3600"/>
+            <w:tcBorders>
+              <w:top w:val="single" w:color="999999" w:sz="4"/>
+              <w:left w:val="single" w:color="999999" w:sz="4"/>
+              <w:bottom w:val="single" w:color="999999" w:sz="4"/>
+              <w:right w:val="single" w:color="999999" w:sz="4"/>
+            </w:tcBorders>
+            <w:tcMar>
+              <w:top w:type="dxa" w:w="80"/>
+              <w:left w:type="dxa" w:w="100"/>
+              <w:bottom w:type="dxa" w:w="80"/>
+              <w:right w:type="dxa" w:w="100"/>
+            </w:tcMar>
+          </w:tcPr>
+          <w:p>
+            <w:pPr>
+              <w:spacing w:after="0" w:before="0"/>
+            </w:pPr>
+            <w:r>
+              <w:rPr>
+                <w:rFonts w:ascii="Arial" w:cs="Arial" w:eastAsia="Arial" w:hAnsi="Arial"/>
+                <w:b w:val="false"/>
+                <w:bCs w:val="false"/>
+                <w:sz w:val="22"/>
+                <w:szCs w:val="22"/>
+              </w:rPr>
+              <w:t xml:space="preserve">wohne</w:t>
+            </w:r>
+          </w:p>
+        </w:tc>
+        <w:tc>
+          <w:tcPr>
+            <w:tcW w:type="dxa" w:w="3638"/>
+            <w:tcBorders>
+              <w:top w:val="single" w:color="999999" w:sz="4"/>
+              <w:left w:val="single" w:color="999999" w:sz="4"/>
+              <w:bottom w:val="single" w:color="999999" w:sz="4"/>
+              <w:right w:val="single" w:color="999999" w:sz="4"/>
+            </w:tcBorders>
+            <w:tcMar>
+              <w:top w:type="dxa" w:w="80"/>
+              <w:left w:type="dxa" w:w="100"/>
+              <w:bottom w:type="dxa" w:w="80"/>
+              <w:right w:type="dxa" w:w="100"/>
+            </w:tcMar>
+          </w:tcPr>
+          <w:p>
+            <w:pPr>
+              <w:spacing w:after="0" w:before="0"/>
+            </w:pPr>
+            <w:r>
+              <w:rPr>
+                <w:rFonts w:ascii="Arial" w:cs="Arial" w:eastAsia="Arial" w:hAnsi="Arial"/>
+                <w:b w:val="false"/>
+                <w:bCs w:val="false"/>
+                <w:sz w:val="22"/>
+                <w:szCs w:val="22"/>
+              </w:rPr>
+              <w:t xml:space="preserve">-e</w:t>
+            </w:r>
+          </w:p>
+        </w:tc>
+      </w:tr>
+      <w:tr>
+        <w:trPr>
+          <w:tblHeader w:val="false"/>
+        </w:trPr>
+        <w:tc>
+          <w:tcPr>
+            <w:tcW w:type="dxa" w:w="2400"/>
+            <w:tcBorders>
+              <w:top w:val="single" w:color="999999" w:sz="4"/>
+              <w:left w:val="single" w:color="999999" w:sz="4"/>
+              <w:bottom w:val="single" w:color="999999" w:sz="4"/>
+              <w:right w:val="single" w:color="999999" w:sz="4"/>
+            </w:tcBorders>
+            <w:shd w:fill="F7F7F7" w:color="auto" w:val="clear"/>
+            <w:tcMar>
+              <w:top w:type="dxa" w:w="80"/>
+              <w:left w:type="dxa" w:w="100"/>
+              <w:bottom w:type="dxa" w:w="80"/>
+              <w:right w:type="dxa" w:w="100"/>
+            </w:tcMar>
+          </w:tcPr>
+          <w:p>
+            <w:pPr>
+              <w:spacing w:after="0" w:before="0"/>
+            </w:pPr>
+            <w:r>
+              <w:rPr>
+                <w:rFonts w:ascii="Arial" w:cs="Arial" w:eastAsia="Arial" w:hAnsi="Arial"/>
+                <w:b/>
+                <w:bCs/>
+                <w:sz w:val="22"/>
+                <w:szCs w:val="22"/>
+              </w:rPr>
+              <w:t xml:space="preserve">du</w:t>
+            </w:r>
+          </w:p>
+        </w:tc>
+        <w:tc>
+          <w:tcPr>
+            <w:tcW w:type="dxa" w:w="3600"/>
+            <w:tcBorders>
+              <w:top w:val="single" w:color="999999" w:sz="4"/>
+              <w:left w:val="single" w:color="999999" w:sz="4"/>
+              <w:bottom w:val="single" w:color="999999" w:sz="4"/>
+              <w:right w:val="single" w:color="999999" w:sz="4"/>
+            </w:tcBorders>
+            <w:tcMar>
+              <w:top w:type="dxa" w:w="80"/>
+              <w:left w:type="dxa" w:w="100"/>
+              <w:bottom w:type="dxa" w:w="80"/>
+              <w:right w:type="dxa" w:w="100"/>
+            </w:tcMar>
+          </w:tcPr>
+          <w:p>
+            <w:pPr>
+              <w:spacing w:after="0" w:before="0"/>
+            </w:pPr>
+            <w:r>
+              <w:rPr>
+                <w:rFonts w:ascii="Arial" w:cs="Arial" w:eastAsia="Arial" w:hAnsi="Arial"/>
+                <w:b w:val="false"/>
+                <w:bCs w:val="false"/>
+                <w:sz w:val="22"/>
+                <w:szCs w:val="22"/>
+              </w:rPr>
+              <w:t xml:space="preserve">wohnst</w:t>
+            </w:r>
+          </w:p>
+        </w:tc>
+        <w:tc>
+          <w:tcPr>
+            <w:tcW w:type="dxa" w:w="3638"/>
+            <w:tcBorders>
+              <w:top w:val="single" w:color="999999" w:sz="4"/>
+              <w:left w:val="single" w:color="999999" w:sz="4"/>
+              <w:bottom w:val="single" w:color="999999" w:sz="4"/>
+              <w:right w:val="single" w:color="999999" w:sz="4"/>
+            </w:tcBorders>
+            <w:tcMar>
+              <w:top w:type="dxa" w:w="80"/>
+              <w:left w:type="dxa" w:w="100"/>
+              <w:bottom w:type="dxa" w:w="80"/>
+              <w:right w:type="dxa" w:w="100"/>
+            </w:tcMar>
+          </w:tcPr>
+          <w:p>
+            <w:pPr>
+              <w:spacing w:after="0" w:before="0"/>
+            </w:pPr>
+            <w:r>
+              <w:rPr>
+                <w:rFonts w:ascii="Arial" w:cs="Arial" w:eastAsia="Arial" w:hAnsi="Arial"/>
+                <w:b w:val="false"/>
+                <w:bCs w:val="false"/>
+                <w:sz w:val="22"/>
+                <w:szCs w:val="22"/>
+              </w:rPr>
+              <w:t xml:space="preserve">-st</w:t>
+            </w:r>
+          </w:p>
+        </w:tc>
+      </w:tr>
+      <w:tr>
+        <w:trPr>
+          <w:tblHeader w:val="false"/>
+        </w:trPr>
+        <w:tc>
+          <w:tcPr>
+            <w:tcW w:type="dxa" w:w="2400"/>
+            <w:tcBorders>
+              <w:top w:val="single" w:color="999999" w:sz="4"/>
+              <w:left w:val="single" w:color="999999" w:sz="4"/>
+              <w:bottom w:val="single" w:color="999999" w:sz="4"/>
+              <w:right w:val="single" w:color="999999" w:sz="4"/>
+            </w:tcBorders>
+            <w:shd w:fill="F7F7F7" w:color="auto" w:val="clear"/>
+            <w:tcMar>
+              <w:top w:type="dxa" w:w="80"/>
+              <w:left w:type="dxa" w:w="100"/>
+              <w:bottom w:type="dxa" w:w="80"/>
+              <w:right w:type="dxa" w:w="100"/>
+            </w:tcMar>
+          </w:tcPr>
+          <w:p>
+            <w:pPr>
+              <w:spacing w:after="0" w:before="0"/>
+            </w:pPr>
+            <w:r>
+              <w:rPr>
+                <w:rFonts w:ascii="Arial" w:cs="Arial" w:eastAsia="Arial" w:hAnsi="Arial"/>
+                <w:b/>
+                <w:bCs/>
+                <w:sz w:val="22"/>
+                <w:szCs w:val="22"/>
+              </w:rPr>
+              <w:t xml:space="preserve">er / sie / es</w:t>
+            </w:r>
+          </w:p>
+        </w:tc>
+        <w:tc>
+          <w:tcPr>
+            <w:tcW w:type="dxa" w:w="3600"/>
+            <w:tcBorders>
+              <w:top w:val="single" w:color="999999" w:sz="4"/>
+              <w:left w:val="single" w:color="999999" w:sz="4"/>
+              <w:bottom w:val="single" w:color="999999" w:sz="4"/>
+              <w:right w:val="single" w:color="999999" w:sz="4"/>
+            </w:tcBorders>
+            <w:tcMar>
+              <w:top w:type="dxa" w:w="80"/>
+              <w:left w:type="dxa" w:w="100"/>
+              <w:bottom w:type="dxa" w:w="80"/>
+              <w:right w:type="dxa" w:w="100"/>
+            </w:tcMar>
+          </w:tcPr>
+          <w:p>
+            <w:pPr>
+              <w:spacing w:after="0" w:before="0"/>
+            </w:pPr>
+            <w:r>
+              <w:rPr>
+                <w:rFonts w:ascii="Arial" w:cs="Arial" w:eastAsia="Arial" w:hAnsi="Arial"/>
+                <w:b w:val="false"/>
+                <w:bCs w:val="false"/>
+                <w:sz w:val="22"/>
+                <w:szCs w:val="22"/>
+              </w:rPr>
+              <w:t xml:space="preserve">wohnt</w:t>
+            </w:r>
+          </w:p>
+        </w:tc>
+        <w:tc>
+          <w:tcPr>
+            <w:tcW w:type="dxa" w:w="3638"/>
+            <w:tcBorders>
+              <w:top w:val="single" w:color="999999" w:sz="4"/>
+              <w:left w:val="single" w:color="999999" w:sz="4"/>
+              <w:bottom w:val="single" w:color="999999" w:sz="4"/>
+              <w:right w:val="single" w:color="999999" w:sz="4"/>
+            </w:tcBorders>
+            <w:tcMar>
+              <w:top w:type="dxa" w:w="80"/>
+              <w:left w:type="dxa" w:w="100"/>
+              <w:bottom w:type="dxa" w:w="80"/>
+              <w:right w:type="dxa" w:w="100"/>
+            </w:tcMar>
+          </w:tcPr>
+          <w:p>
+            <w:pPr>
+              <w:spacing w:after="0" w:before="0"/>
+            </w:pPr>
+            <w:r>
+              <w:rPr>
+                <w:rFonts w:ascii="Arial" w:cs="Arial" w:eastAsia="Arial" w:hAnsi="Arial"/>
+                <w:b w:val="false"/>
+                <w:bCs w:val="false"/>
+                <w:sz w:val="22"/>
+                <w:szCs w:val="22"/>
+              </w:rPr>
+              <w:t xml:space="preserve">-t</w:t>
+            </w:r>
+          </w:p>
+        </w:tc>
+      </w:tr>
+      <w:tr>
+        <w:trPr>
+          <w:tblHeader w:val="false"/>
+        </w:trPr>
+        <w:tc>
+          <w:tcPr>
+            <w:tcW w:type="dxa" w:w="2400"/>
+            <w:tcBorders>
+              <w:top w:val="single" w:color="999999" w:sz="4"/>
+              <w:left w:val="single" w:color="999999" w:sz="4"/>
+              <w:bottom w:val="single" w:color="999999" w:sz="4"/>
+              <w:right w:val="single" w:color="999999" w:sz="4"/>
+            </w:tcBorders>
+            <w:shd w:fill="F7F7F7" w:color="auto" w:val="clear"/>
+            <w:tcMar>
+              <w:top w:type="dxa" w:w="80"/>
+              <w:left w:type="dxa" w:w="100"/>
+              <w:bottom w:type="dxa" w:w="80"/>
+              <w:right w:type="dxa" w:w="100"/>
+            </w:tcMar>
+          </w:tcPr>
+          <w:p>
+            <w:pPr>
+              <w:spacing w:after="0" w:before="0"/>
+            </w:pPr>
+            <w:r>
+              <w:rPr>
+                <w:rFonts w:ascii="Arial" w:cs="Arial" w:eastAsia="Arial" w:hAnsi="Arial"/>
+                <w:b/>
+                <w:bCs/>
+                <w:sz w:val="22"/>
+                <w:szCs w:val="22"/>
+              </w:rPr>
+              <w:t xml:space="preserve">wir</w:t>
+            </w:r>
+          </w:p>
+        </w:tc>
+        <w:tc>
+          <w:tcPr>
+            <w:tcW w:type="dxa" w:w="3600"/>
+            <w:tcBorders>
+              <w:top w:val="single" w:color="999999" w:sz="4"/>
+              <w:left w:val="single" w:color="999999" w:sz="4"/>
+              <w:bottom w:val="single" w:color="999999" w:sz="4"/>
+              <w:right w:val="single" w:color="999999" w:sz="4"/>
+            </w:tcBorders>
+            <w:tcMar>
+              <w:top w:type="dxa" w:w="80"/>
+              <w:left w:type="dxa" w:w="100"/>
+              <w:bottom w:type="dxa" w:w="80"/>
+              <w:right w:type="dxa" w:w="100"/>
+            </w:tcMar>
+          </w:tcPr>
+          <w:p>
+            <w:pPr>
+              <w:spacing w:after="0" w:before="0"/>
+            </w:pPr>
+            <w:r>
+              <w:rPr>
+                <w:rFonts w:ascii="Arial" w:cs="Arial" w:eastAsia="Arial" w:hAnsi="Arial"/>
+                <w:b w:val="false"/>
+                <w:bCs w:val="false"/>
+                <w:sz w:val="22"/>
+                <w:szCs w:val="22"/>
+              </w:rPr>
+              <w:t xml:space="preserve">wohnen</w:t>
+            </w:r>
+          </w:p>
+        </w:tc>
+        <w:tc>
+          <w:tcPr>
+            <w:tcW w:type="dxa" w:w="3638"/>
+            <w:tcBorders>
+              <w:top w:val="single" w:color="999999" w:sz="4"/>
+              <w:left w:val="single" w:color="999999" w:sz="4"/>
+              <w:bottom w:val="single" w:color="999999" w:sz="4"/>
+              <w:right w:val="single" w:color="999999" w:sz="4"/>
+            </w:tcBorders>
+            <w:tcMar>
+              <w:top w:type="dxa" w:w="80"/>
+              <w:left w:type="dxa" w:w="100"/>
+              <w:bottom w:type="dxa" w:w="80"/>
+              <w:right w:type="dxa" w:w="100"/>
+            </w:tcMar>
+          </w:tcPr>
+          <w:p>
+            <w:pPr>
+              <w:spacing w:after="0" w:before="0"/>
+            </w:pPr>
+            <w:r>
+              <w:rPr>
+                <w:rFonts w:ascii="Arial" w:cs="Arial" w:eastAsia="Arial" w:hAnsi="Arial"/>
+                <w:b w:val="false"/>
+                <w:bCs w:val="false"/>
+                <w:sz w:val="22"/>
+                <w:szCs w:val="22"/>
+              </w:rPr>
+              <w:t xml:space="preserve">-en</w:t>
+            </w:r>
+          </w:p>
+        </w:tc>
+      </w:tr>
+      <w:tr>
+        <w:trPr>
+          <w:tblHeader w:val="false"/>
+        </w:trPr>
+        <w:tc>
+          <w:tcPr>
+            <w:tcW w:type="dxa" w:w="2400"/>
+            <w:tcBorders>
+              <w:top w:val="single" w:color="999999" w:sz="4"/>
+              <w:left w:val="single" w:color="999999" w:sz="4"/>
+              <w:bottom w:val="single" w:color="999999" w:sz="4"/>
+              <w:right w:val="single" w:color="999999" w:sz="4"/>
+            </w:tcBorders>
+            <w:shd w:fill="F7F7F7" w:color="auto" w:val="clear"/>
+            <w:tcMar>
+              <w:top w:type="dxa" w:w="80"/>
+              <w:left w:type="dxa" w:w="100"/>
+              <w:bottom w:type="dxa" w:w="80"/>
+              <w:right w:type="dxa" w:w="100"/>
+            </w:tcMar>
+          </w:tcPr>
+          <w:p>
+            <w:pPr>
+              <w:spacing w:after="0" w:before="0"/>
+            </w:pPr>
+            <w:r>
+              <w:rPr>
+                <w:rFonts w:ascii="Arial" w:cs="Arial" w:eastAsia="Arial" w:hAnsi="Arial"/>
+                <w:b/>
+                <w:bCs/>
+                <w:sz w:val="22"/>
+                <w:szCs w:val="22"/>
+              </w:rPr>
+              <w:t xml:space="preserve">ihr</w:t>
+            </w:r>
+          </w:p>
+        </w:tc>
+        <w:tc>
+          <w:tcPr>
+            <w:tcW w:type="dxa" w:w="3600"/>
+            <w:tcBorders>
+              <w:top w:val="single" w:color="999999" w:sz="4"/>
+              <w:left w:val="single" w:color="999999" w:sz="4"/>
+              <w:bottom w:val="single" w:color="999999" w:sz="4"/>
+              <w:right w:val="single" w:color="999999" w:sz="4"/>
+            </w:tcBorders>
+            <w:tcMar>
+              <w:top w:type="dxa" w:w="80"/>
+              <w:left w:type="dxa" w:w="100"/>
+              <w:bottom w:type="dxa" w:w="80"/>
+              <w:right w:type="dxa" w:w="100"/>
+            </w:tcMar>
+          </w:tcPr>
+          <w:p>
+            <w:pPr>
+              <w:spacing w:after="0" w:before="0"/>
+            </w:pPr>
+            <w:r>
+              <w:rPr>
+                <w:rFonts w:ascii="Arial" w:cs="Arial" w:eastAsia="Arial" w:hAnsi="Arial"/>
+                <w:b w:val="false"/>
+                <w:bCs w:val="false"/>
+                <w:sz w:val="22"/>
+                <w:szCs w:val="22"/>
+              </w:rPr>
+              <w:t xml:space="preserve">wohnt</w:t>
+            </w:r>
+          </w:p>
+        </w:tc>
+        <w:tc>
+          <w:tcPr>
+            <w:tcW w:type="dxa" w:w="3638"/>
+            <w:tcBorders>
+              <w:top w:val="single" w:color="999999" w:sz="4"/>
+              <w:left w:val="single" w:color="999999" w:sz="4"/>
+              <w:bottom w:val="single" w:color="999999" w:sz="4"/>
+              <w:right w:val="single" w:color="999999" w:sz="4"/>
+            </w:tcBorders>
+            <w:tcMar>
+              <w:top w:type="dxa" w:w="80"/>
+              <w:left w:type="dxa" w:w="100"/>
+              <w:bottom w:type="dxa" w:w="80"/>
+              <w:right w:type="dxa" w:w="100"/>
+            </w:tcMar>
+          </w:tcPr>
+          <w:p>
+            <w:pPr>
+              <w:spacing w:after="0" w:before="0"/>
+            </w:pPr>
+            <w:r>
+              <w:rPr>
+                <w:rFonts w:ascii="Arial" w:cs="Arial" w:eastAsia="Arial" w:hAnsi="Arial"/>
+                <w:b w:val="false"/>
+                <w:bCs w:val="false"/>
+                <w:sz w:val="22"/>
+                <w:szCs w:val="22"/>
+              </w:rPr>
+              <w:t xml:space="preserve">-t</w:t>
+            </w:r>
+          </w:p>
+        </w:tc>
+      </w:tr>
+      <w:tr>
+        <w:trPr>
+          <w:tblHeader w:val="false"/>
+        </w:trPr>
+        <w:tc>
+          <w:tcPr>
+            <w:tcW w:type="dxa" w:w="2400"/>
+            <w:tcBorders>
+              <w:top w:val="single" w:color="999999" w:sz="4"/>
+              <w:left w:val="single" w:color="999999" w:sz="4"/>
+              <w:bottom w:val="single" w:color="999999" w:sz="4"/>
+              <w:right w:val="single" w:color="999999" w:sz="4"/>
+            </w:tcBorders>
+            <w:shd w:fill="F7F7F7" w:color="auto" w:val="clear"/>
+            <w:tcMar>
+              <w:top w:type="dxa" w:w="80"/>
+              <w:left w:type="dxa" w:w="100"/>
+              <w:bottom w:type="dxa" w:w="80"/>
+              <w:right w:type="dxa" w:w="100"/>
+            </w:tcMar>
+          </w:tcPr>
+          <w:p>
+            <w:pPr>
+              <w:spacing w:after="0" w:before="0"/>
+            </w:pPr>
+            <w:r>
+              <w:rPr>
+                <w:rFonts w:ascii="Arial" w:cs="Arial" w:eastAsia="Arial" w:hAnsi="Arial"/>
+                <w:b/>
+                <w:bCs/>
+                <w:sz w:val="22"/>
+                <w:szCs w:val="22"/>
+              </w:rPr>
+              <w:t xml:space="preserve">sie / Sie</w:t>
+            </w:r>
+          </w:p>
+        </w:tc>
+        <w:tc>
+          <w:tcPr>
+            <w:tcW w:type="dxa" w:w="3600"/>
+            <w:tcBorders>
+              <w:top w:val="single" w:color="999999" w:sz="4"/>
+              <w:left w:val="single" w:color="999999" w:sz="4"/>
+              <w:bottom w:val="single" w:color="999999" w:sz="4"/>
+              <w:right w:val="single" w:color="999999" w:sz="4"/>
+            </w:tcBorders>
+            <w:tcMar>
+              <w:top w:type="dxa" w:w="80"/>
+              <w:left w:type="dxa" w:w="100"/>
+              <w:bottom w:type="dxa" w:w="80"/>
+              <w:right w:type="dxa" w:w="100"/>
+            </w:tcMar>
+          </w:tcPr>
+          <w:p>
+            <w:pPr>
+              <w:spacing w:after="0" w:before="0"/>
+            </w:pPr>
+            <w:r>
+              <w:rPr>
+                <w:rFonts w:ascii="Arial" w:cs="Arial" w:eastAsia="Arial" w:hAnsi="Arial"/>
+                <w:b w:val="false"/>
+                <w:bCs w:val="false"/>
+                <w:sz w:val="22"/>
+                <w:szCs w:val="22"/>
+              </w:rPr>
+              <w:t xml:space="preserve">wohnen</w:t>
+            </w:r>
+          </w:p>
+        </w:tc>
+        <w:tc>
+          <w:tcPr>
+            <w:tcW w:type="dxa" w:w="3638"/>
+            <w:tcBorders>
+              <w:top w:val="single" w:color="999999" w:sz="4"/>
+              <w:left w:val="single" w:color="999999" w:sz="4"/>
+              <w:bottom w:val="single" w:color="999999" w:sz="4"/>
+              <w:right w:val="single" w:color="999999" w:sz="4"/>
+            </w:tcBorders>
+            <w:tcMar>
+              <w:top w:type="dxa" w:w="80"/>
+              <w:left w:type="dxa" w:w="100"/>
+              <w:bottom w:type="dxa" w:w="80"/>
+              <w:right w:type="dxa" w:w="100"/>
+            </w:tcMar>
+          </w:tcPr>
+          <w:p>
+            <w:pPr>
+              <w:spacing w:after="0" w:before="0"/>
+            </w:pPr>
+            <w:r>
+              <w:rPr>
+                <w:rFonts w:ascii="Arial" w:cs="Arial" w:eastAsia="Arial" w:hAnsi="Arial"/>
+                <w:b w:val="false"/>
+                <w:bCs w:val="false"/>
+                <w:sz w:val="22"/>
+                <w:szCs w:val="22"/>
+              </w:rPr>
+              <w:t xml:space="preserve">-en</w:t>
+            </w:r>
+          </w:p>
+        </w:tc>
+      </w:tr>
+    </w:tbl>
+    <w:p>
+      <w:pPr>
+        <w:spacing w:after="60" w:before="140"/>
+      </w:pPr>
+      <w:r>
+        <w:rPr>
+          <w:rFonts w:ascii="Arial" w:cs="Arial" w:eastAsia="Arial" w:hAnsi="Arial"/>
+          <w:b/>
+          <w:bCs/>
+          <w:sz w:val="24"/>
+          <w:szCs w:val="24"/>
+        </w:rPr>
+        <w:t xml:space="preserve">Особые случаи:</w:t>
+      </w:r>
+    </w:p>
+    <w:p>
+      <w:pPr>
+        <w:spacing w:after="60" w:before="0"/>
+      </w:pPr>
+      <w:r>
+        <w:rPr>
+          <w:rFonts w:ascii="Arial" w:cs="Arial" w:eastAsia="Arial" w:hAnsi="Arial"/>
+          <w:sz w:val="24"/>
+          <w:szCs w:val="24"/>
+        </w:rPr>
+        <w:t xml:space="preserve">• Основа на -t / -d → добавляется -e-: arbeiten — du arbeitest, er arbeitet, ihr arbeitet.</w:t>
+      </w:r>
+    </w:p>
+    <w:p>
+      <w:pPr>
+        <w:spacing w:after="60" w:before="0"/>
+      </w:pPr>
+      <w:r>
+        <w:rPr>
+          <w:rFonts w:ascii="Arial" w:cs="Arial" w:eastAsia="Arial" w:hAnsi="Arial"/>
+          <w:sz w:val="24"/>
+          <w:szCs w:val="24"/>
+        </w:rPr>
+        <w:t xml:space="preserve">• Основа на -s / -ß / -z → у du окончание только -t: heißen — du heißt (не «heißst»).</w:t>
+      </w:r>
+    </w:p>
+    <w:p>
+      <w:pPr>
+        <w:spacing w:after="100" w:before="0"/>
+      </w:pPr>
+      <w:r>
+        <w:rPr>
+          <w:rFonts w:ascii="Arial" w:cs="Arial" w:eastAsia="Arial" w:hAnsi="Arial"/>
+          <w:sz w:val="24"/>
+          <w:szCs w:val="24"/>
+        </w:rPr>
+        <w:t xml:space="preserve">• Глагол стоит на втором месте (Position II, см. день 1).</w:t>
+      </w:r>
+    </w:p>
+    <w:p>
+      <w:pPr>
+        <w:keepNext/>
+        <w:spacing w:after="80" w:before="160"/>
+      </w:pPr>
+      <w:r>
+        <w:rPr>
+          <w:rFonts w:ascii="Arial" w:cs="Arial" w:eastAsia="Arial" w:hAnsi="Arial"/>
+          <w:b/>
+          <w:bCs/>
+          <w:sz w:val="24"/>
+          <w:szCs w:val="24"/>
+        </w:rPr>
+        <w:t xml:space="preserve">3. Вопросы</w:t>
+      </w:r>
+    </w:p>
+    <w:p>
+      <w:pPr>
+        <w:spacing w:after="120" w:before="0"/>
+      </w:pPr>
+      <w:r>
+        <w:rPr>
+          <w:rFonts w:ascii="Arial" w:cs="Arial" w:eastAsia="Arial" w:hAnsi="Arial"/>
+          <w:b/>
+          <w:bCs/>
+          <w:sz w:val="24"/>
+          <w:szCs w:val="24"/>
+        </w:rPr>
+        <w:t xml:space="preserve">W-вопрос: </w:t>
+      </w:r>
+      <w:r>
+        <w:rPr>
+          <w:rFonts w:ascii="Arial" w:cs="Arial" w:eastAsia="Arial" w:hAnsi="Arial"/>
+          <w:sz w:val="24"/>
+          <w:szCs w:val="24"/>
+        </w:rPr>
+        <w:t xml:space="preserve">вопросительное слово на Position I, глагол на Position II. Woher kommst du? · Wo wohnen Sie? · Wie heißt du?</w:t>
+      </w:r>
+    </w:p>
+    <w:p>
+      <w:pPr>
+        <w:spacing w:after="120" w:before="0"/>
+      </w:pPr>
+      <w:r>
+        <w:rPr>
+          <w:rFonts w:ascii="Arial" w:cs="Arial" w:eastAsia="Arial" w:hAnsi="Arial"/>
+          <w:b/>
+          <w:bCs/>
+          <w:sz w:val="24"/>
+          <w:szCs w:val="24"/>
+        </w:rPr>
+        <w:t xml:space="preserve">Вопрос «да/нет»: </w:t>
+      </w:r>
+      <w:r>
+        <w:rPr>
+          <w:rFonts w:ascii="Arial" w:cs="Arial" w:eastAsia="Arial" w:hAnsi="Arial"/>
+          <w:sz w:val="24"/>
+          <w:szCs w:val="24"/>
+        </w:rPr>
+        <w:t xml:space="preserve">глагол на Position I. Wohnst du in Berlin? – Ja, ich wohne in Berlin. / Nein, ich wohne in Wien.</w:t>
+      </w:r>
+    </w:p>
+    <w:p>
+      <w:pPr>
+        <w:keepNext/>
+        <w:spacing w:after="80" w:before="160"/>
+      </w:pPr>
+      <w:r>
+        <w:rPr>
+          <w:rFonts w:ascii="Arial" w:cs="Arial" w:eastAsia="Arial" w:hAnsi="Arial"/>
+          <w:b/>
+          <w:bCs/>
+          <w:sz w:val="24"/>
+          <w:szCs w:val="24"/>
+        </w:rPr>
+        <w:t xml:space="preserve">4. Страны: aus + название</w:t>
+      </w:r>
+    </w:p>
+    <w:p>
+      <w:pPr>
+        <w:spacing w:after="120" w:before="0"/>
+      </w:pPr>
+      <w:r>
+        <w:rPr>
+          <w:rFonts w:ascii="Arial" w:cs="Arial" w:eastAsia="Arial" w:hAnsi="Arial"/>
+          <w:sz w:val="24"/>
+          <w:szCs w:val="24"/>
+        </w:rPr>
+        <w:t xml:space="preserve">Без артикля: aus Deutschland, aus Österreich, aus Russland, aus Polen. С артиклем (die Schweiz, die Ukraine) форма другая: aus der Schweiz, aus der Ukraine. Пока выучите их как готовые фразы (причину разберём в неделе 5).</w:t>
+      </w:r>
+    </w:p>
+    <w:p>
+      <w:pPr>
+        <w:keepNext/>
+        <w:pBdr>
+          <w:bottom w:val="single" w:color="1F3864" w:sz="6" w:space="2"/>
+        </w:pBdr>
+        <w:spacing w:after="120" w:before="300"/>
+      </w:pPr>
+      <w:r>
+        <w:rPr>
+          <w:rFonts w:ascii="Arial" w:cs="Arial" w:eastAsia="Arial" w:hAnsi="Arial"/>
+          <w:b/>
+          <w:bCs/>
+          <w:color w:val="1F3864"/>
+          <w:sz w:val="28"/>
+          <w:szCs w:val="28"/>
+        </w:rPr>
+        <w:t xml:space="preserve">Новые слова (19)</w:t>
+      </w:r>
+    </w:p>
+    <w:tbl>
+      <w:tblPr>
+        <w:tblW w:type="dxa" w:w="9638"/>
+        <w:tblBorders>
+          <w:top w:val="single" w:color="auto" w:sz="4"/>
+          <w:left w:val="single" w:color="auto" w:sz="4"/>
+          <w:bottom w:val="single" w:color="auto" w:sz="4"/>
+          <w:right w:val="single" w:color="auto" w:sz="4"/>
+          <w:insideH w:val="single" w:color="auto" w:sz="4"/>
+          <w:insideV w:val="single" w:color="auto" w:sz="4"/>
+        </w:tblBorders>
+      </w:tblPr>
+      <w:tblGrid>
+        <w:gridCol w:w="2900"/>
+        <w:gridCol w:w="2400"/>
+        <w:gridCol w:w="4338"/>
+      </w:tblGrid>
+      <w:tr>
+        <w:trPr>
+          <w:tblHeader/>
+        </w:trPr>
+        <w:tc>
+          <w:tcPr>
+            <w:tcW w:type="dxa" w:w="2900"/>
+            <w:tcBorders>
+              <w:top w:val="single" w:color="999999" w:sz="4"/>
+              <w:left w:val="single" w:color="999999" w:sz="4"/>
+              <w:bottom w:val="single" w:color="999999" w:sz="4"/>
+              <w:right w:val="single" w:color="999999" w:sz="4"/>
+            </w:tcBorders>
+            <w:shd w:fill="E7ECF5" w:color="auto" w:val="clear"/>
+            <w:tcMar>
+              <w:top w:type="dxa" w:w="80"/>
+              <w:left w:type="dxa" w:w="100"/>
+              <w:bottom w:type="dxa" w:w="80"/>
+              <w:right w:type="dxa" w:w="100"/>
+            </w:tcMar>
+          </w:tcPr>
+          <w:p>
+            <w:pPr>
+              <w:spacing w:after="0" w:before="0"/>
+            </w:pPr>
+            <w:r>
+              <w:rPr>
+                <w:rFonts w:ascii="Arial" w:cs="Arial" w:eastAsia="Arial" w:hAnsi="Arial"/>
+                <w:b/>
+                <w:bCs/>
+                <w:sz w:val="22"/>
+                <w:szCs w:val="22"/>
+              </w:rPr>
+              <w:t xml:space="preserve">Немецкий</w:t>
+            </w:r>
+          </w:p>
+        </w:tc>
+        <w:tc>
+          <w:tcPr>
+            <w:tcW w:type="dxa" w:w="2400"/>
+            <w:tcBorders>
+              <w:top w:val="single" w:color="999999" w:sz="4"/>
+              <w:left w:val="single" w:color="999999" w:sz="4"/>
+              <w:bottom w:val="single" w:color="999999" w:sz="4"/>
+              <w:right w:val="single" w:color="999999" w:sz="4"/>
+            </w:tcBorders>
+            <w:shd w:fill="E7ECF5" w:color="auto" w:val="clear"/>
+            <w:tcMar>
+              <w:top w:type="dxa" w:w="80"/>
+              <w:left w:type="dxa" w:w="100"/>
+              <w:bottom w:type="dxa" w:w="80"/>
+              <w:right w:type="dxa" w:w="100"/>
+            </w:tcMar>
+          </w:tcPr>
+          <w:p>
+            <w:pPr>
+              <w:spacing w:after="0" w:before="0"/>
+            </w:pPr>
+            <w:r>
+              <w:rPr>
+                <w:rFonts w:ascii="Arial" w:cs="Arial" w:eastAsia="Arial" w:hAnsi="Arial"/>
+                <w:b/>
+                <w:bCs/>
+                <w:sz w:val="22"/>
+                <w:szCs w:val="22"/>
+              </w:rPr>
+              <w:t xml:space="preserve">Русский</w:t>
+            </w:r>
+          </w:p>
+        </w:tc>
+        <w:tc>
+          <w:tcPr>
+            <w:tcW w:type="dxa" w:w="4338"/>
+            <w:tcBorders>
+              <w:top w:val="single" w:color="999999" w:sz="4"/>
+              <w:left w:val="single" w:color="999999" w:sz="4"/>
+              <w:bottom w:val="single" w:color="999999" w:sz="4"/>
+              <w:right w:val="single" w:color="999999" w:sz="4"/>
+            </w:tcBorders>
+            <w:shd w:fill="E7ECF5" w:color="auto" w:val="clear"/>
+            <w:tcMar>
+              <w:top w:type="dxa" w:w="80"/>
+              <w:left w:type="dxa" w:w="100"/>
+              <w:bottom w:type="dxa" w:w="80"/>
+              <w:right w:type="dxa" w:w="100"/>
+            </w:tcMar>
+          </w:tcPr>
+          <w:p>
+            <w:pPr>
+              <w:spacing w:after="0" w:before="0"/>
+            </w:pPr>
+            <w:r>
+              <w:rPr>
+                <w:rFonts w:ascii="Arial" w:cs="Arial" w:eastAsia="Arial" w:hAnsi="Arial"/>
+                <w:b/>
+                <w:bCs/>
+                <w:sz w:val="22"/>
+                <w:szCs w:val="22"/>
+              </w:rPr>
+              <w:t xml:space="preserve">Пример</w:t>
+            </w:r>
+          </w:p>
+        </w:tc>
+      </w:tr>
+      <w:tr>
+        <w:trPr>
+          <w:tblHeader w:val="false"/>
+        </w:trPr>
+        <w:tc>
+          <w:tcPr>
+            <w:tcW w:type="dxa" w:w="2900"/>
+            <w:tcBorders>
+              <w:top w:val="single" w:color="999999" w:sz="4"/>
+              <w:left w:val="single" w:color="999999" w:sz="4"/>
+              <w:bottom w:val="single" w:color="999999" w:sz="4"/>
+              <w:right w:val="single" w:color="999999" w:sz="4"/>
+            </w:tcBorders>
+            <w:shd w:fill="F7F7F7" w:color="auto" w:val="clear"/>
+            <w:tcMar>
+              <w:top w:type="dxa" w:w="80"/>
+              <w:left w:type="dxa" w:w="100"/>
+              <w:bottom w:type="dxa" w:w="80"/>
+              <w:right w:type="dxa" w:w="100"/>
+            </w:tcMar>
+          </w:tcPr>
+          <w:p>
+            <w:pPr>
+              <w:spacing w:after="0" w:before="0"/>
+            </w:pPr>
+            <w:r>
+              <w:rPr>
+                <w:rFonts w:ascii="Arial" w:cs="Arial" w:eastAsia="Arial" w:hAnsi="Arial"/>
+                <w:b/>
+                <w:bCs/>
+                <w:sz w:val="22"/>
+                <w:szCs w:val="22"/>
+              </w:rPr>
+              <w:t xml:space="preserve">wer?</w:t>
+            </w:r>
+          </w:p>
+        </w:tc>
+        <w:tc>
+          <w:tcPr>
+            <w:tcW w:type="dxa" w:w="2400"/>
+            <w:tcBorders>
+              <w:top w:val="single" w:color="999999" w:sz="4"/>
+              <w:left w:val="single" w:color="999999" w:sz="4"/>
+              <w:bottom w:val="single" w:color="999999" w:sz="4"/>
+              <w:right w:val="single" w:color="999999" w:sz="4"/>
+            </w:tcBorders>
+            <w:tcMar>
+              <w:top w:type="dxa" w:w="80"/>
+              <w:left w:type="dxa" w:w="100"/>
+              <w:bottom w:type="dxa" w:w="80"/>
+              <w:right w:type="dxa" w:w="100"/>
+            </w:tcMar>
+          </w:tcPr>
+          <w:p>
+            <w:pPr>
+              <w:spacing w:after="0" w:before="0"/>
+            </w:pPr>
+            <w:r>
+              <w:rPr>
+                <w:rFonts w:ascii="Arial" w:cs="Arial" w:eastAsia="Arial" w:hAnsi="Arial"/>
+                <w:b w:val="false"/>
+                <w:bCs w:val="false"/>
+                <w:sz w:val="22"/>
+                <w:szCs w:val="22"/>
+              </w:rPr>
+              <w:t xml:space="preserve">кто?</w:t>
+            </w:r>
+          </w:p>
+        </w:tc>
+        <w:tc>
+          <w:tcPr>
+            <w:tcW w:type="dxa" w:w="4338"/>
+            <w:tcBorders>
+              <w:top w:val="single" w:color="999999" w:sz="4"/>
+              <w:left w:val="single" w:color="999999" w:sz="4"/>
+              <w:bottom w:val="single" w:color="999999" w:sz="4"/>
+              <w:right w:val="single" w:color="999999" w:sz="4"/>
+            </w:tcBorders>
+            <w:tcMar>
+              <w:top w:type="dxa" w:w="80"/>
+              <w:left w:type="dxa" w:w="100"/>
+              <w:bottom w:type="dxa" w:w="80"/>
+              <w:right w:type="dxa" w:w="100"/>
+            </w:tcMar>
+          </w:tcPr>
+          <w:p>
+            <w:pPr>
+              <w:spacing w:after="0" w:before="0"/>
+            </w:pPr>
+            <w:r>
+              <w:rPr>
+                <w:rFonts w:ascii="Arial" w:cs="Arial" w:eastAsia="Arial" w:hAnsi="Arial"/>
+                <w:b w:val="false"/>
+                <w:bCs w:val="false"/>
+                <w:sz w:val="22"/>
+                <w:szCs w:val="22"/>
+              </w:rPr>
+              <w:t xml:space="preserve">Wer ist das?</w:t>
+            </w:r>
+          </w:p>
+        </w:tc>
+      </w:tr>
+      <w:tr>
+        <w:trPr>
+          <w:tblHeader w:val="false"/>
+        </w:trPr>
+        <w:tc>
+          <w:tcPr>
+            <w:tcW w:type="dxa" w:w="2900"/>
+            <w:tcBorders>
+              <w:top w:val="single" w:color="999999" w:sz="4"/>
+              <w:left w:val="single" w:color="999999" w:sz="4"/>
+              <w:bottom w:val="single" w:color="999999" w:sz="4"/>
+              <w:right w:val="single" w:color="999999" w:sz="4"/>
+            </w:tcBorders>
+            <w:shd w:fill="F7F7F7" w:color="auto" w:val="clear"/>
+            <w:tcMar>
+              <w:top w:type="dxa" w:w="80"/>
+              <w:left w:type="dxa" w:w="100"/>
+              <w:bottom w:type="dxa" w:w="80"/>
+              <w:right w:type="dxa" w:w="100"/>
+            </w:tcMar>
+          </w:tcPr>
+          <w:p>
+            <w:pPr>
+              <w:spacing w:after="0" w:before="0"/>
+            </w:pPr>
+            <w:r>
+              <w:rPr>
+                <w:rFonts w:ascii="Arial" w:cs="Arial" w:eastAsia="Arial" w:hAnsi="Arial"/>
+                <w:b/>
+                <w:bCs/>
+                <w:sz w:val="22"/>
+                <w:szCs w:val="22"/>
+              </w:rPr>
+              <w:t xml:space="preserve">was?</w:t>
+            </w:r>
+          </w:p>
+        </w:tc>
+        <w:tc>
+          <w:tcPr>
+            <w:tcW w:type="dxa" w:w="2400"/>
+            <w:tcBorders>
+              <w:top w:val="single" w:color="999999" w:sz="4"/>
+              <w:left w:val="single" w:color="999999" w:sz="4"/>
+              <w:bottom w:val="single" w:color="999999" w:sz="4"/>
+              <w:right w:val="single" w:color="999999" w:sz="4"/>
+            </w:tcBorders>
+            <w:tcMar>
+              <w:top w:type="dxa" w:w="80"/>
+              <w:left w:type="dxa" w:w="100"/>
+              <w:bottom w:type="dxa" w:w="80"/>
+              <w:right w:type="dxa" w:w="100"/>
+            </w:tcMar>
+          </w:tcPr>
+          <w:p>
+            <w:pPr>
+              <w:spacing w:after="0" w:before="0"/>
+            </w:pPr>
+            <w:r>
+              <w:rPr>
+                <w:rFonts w:ascii="Arial" w:cs="Arial" w:eastAsia="Arial" w:hAnsi="Arial"/>
+                <w:b w:val="false"/>
+                <w:bCs w:val="false"/>
+                <w:sz w:val="22"/>
+                <w:szCs w:val="22"/>
+              </w:rPr>
+              <w:t xml:space="preserve">что?</w:t>
+            </w:r>
+          </w:p>
+        </w:tc>
+        <w:tc>
+          <w:tcPr>
+            <w:tcW w:type="dxa" w:w="4338"/>
+            <w:tcBorders>
+              <w:top w:val="single" w:color="999999" w:sz="4"/>
+              <w:left w:val="single" w:color="999999" w:sz="4"/>
+              <w:bottom w:val="single" w:color="999999" w:sz="4"/>
+              <w:right w:val="single" w:color="999999" w:sz="4"/>
+            </w:tcBorders>
+            <w:tcMar>
+              <w:top w:type="dxa" w:w="80"/>
+              <w:left w:type="dxa" w:w="100"/>
+              <w:bottom w:type="dxa" w:w="80"/>
+              <w:right w:type="dxa" w:w="100"/>
+            </w:tcMar>
+          </w:tcPr>
+          <w:p>
+            <w:pPr>
+              <w:spacing w:after="0" w:before="0"/>
+            </w:pPr>
+            <w:r>
+              <w:rPr>
+                <w:rFonts w:ascii="Arial" w:cs="Arial" w:eastAsia="Arial" w:hAnsi="Arial"/>
+                <w:b w:val="false"/>
+                <w:bCs w:val="false"/>
+                <w:sz w:val="22"/>
+                <w:szCs w:val="22"/>
+              </w:rPr>
+              <w:t xml:space="preserve">Was machst du?</w:t>
+            </w:r>
+          </w:p>
+        </w:tc>
+      </w:tr>
+      <w:tr>
+        <w:trPr>
+          <w:tblHeader w:val="false"/>
+        </w:trPr>
+        <w:tc>
+          <w:tcPr>
+            <w:tcW w:type="dxa" w:w="2900"/>
+            <w:tcBorders>
+              <w:top w:val="single" w:color="999999" w:sz="4"/>
+              <w:left w:val="single" w:color="999999" w:sz="4"/>
+              <w:bottom w:val="single" w:color="999999" w:sz="4"/>
+              <w:right w:val="single" w:color="999999" w:sz="4"/>
+            </w:tcBorders>
+            <w:shd w:fill="F7F7F7" w:color="auto" w:val="clear"/>
+            <w:tcMar>
+              <w:top w:type="dxa" w:w="80"/>
+              <w:left w:type="dxa" w:w="100"/>
+              <w:bottom w:type="dxa" w:w="80"/>
+              <w:right w:type="dxa" w:w="100"/>
+            </w:tcMar>
+          </w:tcPr>
+          <w:p>
+            <w:pPr>
+              <w:spacing w:after="0" w:before="0"/>
+            </w:pPr>
+            <w:r>
+              <w:rPr>
+                <w:rFonts w:ascii="Arial" w:cs="Arial" w:eastAsia="Arial" w:hAnsi="Arial"/>
+                <w:b/>
+                <w:bCs/>
+                <w:sz w:val="22"/>
+                <w:szCs w:val="22"/>
+              </w:rPr>
+              <w:t xml:space="preserve">wie?</w:t>
+            </w:r>
+          </w:p>
+        </w:tc>
+        <w:tc>
+          <w:tcPr>
+            <w:tcW w:type="dxa" w:w="2400"/>
+            <w:tcBorders>
+              <w:top w:val="single" w:color="999999" w:sz="4"/>
+              <w:left w:val="single" w:color="999999" w:sz="4"/>
+              <w:bottom w:val="single" w:color="999999" w:sz="4"/>
+              <w:right w:val="single" w:color="999999" w:sz="4"/>
+            </w:tcBorders>
+            <w:tcMar>
+              <w:top w:type="dxa" w:w="80"/>
+              <w:left w:type="dxa" w:w="100"/>
+              <w:bottom w:type="dxa" w:w="80"/>
+              <w:right w:type="dxa" w:w="100"/>
+            </w:tcMar>
+          </w:tcPr>
+          <w:p>
+            <w:pPr>
+              <w:spacing w:after="0" w:before="0"/>
+            </w:pPr>
+            <w:r>
+              <w:rPr>
+                <w:rFonts w:ascii="Arial" w:cs="Arial" w:eastAsia="Arial" w:hAnsi="Arial"/>
+                <w:b w:val="false"/>
+                <w:bCs w:val="false"/>
+                <w:sz w:val="22"/>
+                <w:szCs w:val="22"/>
+              </w:rPr>
+              <w:t xml:space="preserve">как?</w:t>
+            </w:r>
+          </w:p>
+        </w:tc>
+        <w:tc>
+          <w:tcPr>
+            <w:tcW w:type="dxa" w:w="4338"/>
+            <w:tcBorders>
+              <w:top w:val="single" w:color="999999" w:sz="4"/>
+              <w:left w:val="single" w:color="999999" w:sz="4"/>
+              <w:bottom w:val="single" w:color="999999" w:sz="4"/>
+              <w:right w:val="single" w:color="999999" w:sz="4"/>
+            </w:tcBorders>
+            <w:tcMar>
+              <w:top w:type="dxa" w:w="80"/>
+              <w:left w:type="dxa" w:w="100"/>
+              <w:bottom w:type="dxa" w:w="80"/>
+              <w:right w:type="dxa" w:w="100"/>
+            </w:tcMar>
+          </w:tcPr>
+          <w:p>
+            <w:pPr>
+              <w:spacing w:after="0" w:before="0"/>
+            </w:pPr>
+            <w:r>
+              <w:rPr>
+                <w:rFonts w:ascii="Arial" w:cs="Arial" w:eastAsia="Arial" w:hAnsi="Arial"/>
+                <w:b w:val="false"/>
+                <w:bCs w:val="false"/>
+                <w:sz w:val="22"/>
+                <w:szCs w:val="22"/>
+              </w:rPr>
+              <w:t xml:space="preserve">Wie heißen Sie?</w:t>
+            </w:r>
+          </w:p>
+        </w:tc>
+      </w:tr>
+      <w:tr>
+        <w:trPr>
+          <w:tblHeader w:val="false"/>
+        </w:trPr>
+        <w:tc>
+          <w:tcPr>
+            <w:tcW w:type="dxa" w:w="2900"/>
+            <w:tcBorders>
+              <w:top w:val="single" w:color="999999" w:sz="4"/>
+              <w:left w:val="single" w:color="999999" w:sz="4"/>
+              <w:bottom w:val="single" w:color="999999" w:sz="4"/>
+              <w:right w:val="single" w:color="999999" w:sz="4"/>
+            </w:tcBorders>
+            <w:shd w:fill="F7F7F7" w:color="auto" w:val="clear"/>
+            <w:tcMar>
+              <w:top w:type="dxa" w:w="80"/>
+              <w:left w:type="dxa" w:w="100"/>
+              <w:bottom w:type="dxa" w:w="80"/>
+              <w:right w:type="dxa" w:w="100"/>
+            </w:tcMar>
+          </w:tcPr>
+          <w:p>
+            <w:pPr>
+              <w:spacing w:after="0" w:before="0"/>
+            </w:pPr>
+            <w:r>
+              <w:rPr>
+                <w:rFonts w:ascii="Arial" w:cs="Arial" w:eastAsia="Arial" w:hAnsi="Arial"/>
+                <w:b/>
+                <w:bCs/>
+                <w:sz w:val="22"/>
+                <w:szCs w:val="22"/>
+              </w:rPr>
+              <w:t xml:space="preserve">wo?</w:t>
+            </w:r>
+          </w:p>
+        </w:tc>
+        <w:tc>
+          <w:tcPr>
+            <w:tcW w:type="dxa" w:w="2400"/>
+            <w:tcBorders>
+              <w:top w:val="single" w:color="999999" w:sz="4"/>
+              <w:left w:val="single" w:color="999999" w:sz="4"/>
+              <w:bottom w:val="single" w:color="999999" w:sz="4"/>
+              <w:right w:val="single" w:color="999999" w:sz="4"/>
+            </w:tcBorders>
+            <w:tcMar>
+              <w:top w:type="dxa" w:w="80"/>
+              <w:left w:type="dxa" w:w="100"/>
+              <w:bottom w:type="dxa" w:w="80"/>
+              <w:right w:type="dxa" w:w="100"/>
+            </w:tcMar>
+          </w:tcPr>
+          <w:p>
+            <w:pPr>
+              <w:spacing w:after="0" w:before="0"/>
+            </w:pPr>
+            <w:r>
+              <w:rPr>
+                <w:rFonts w:ascii="Arial" w:cs="Arial" w:eastAsia="Arial" w:hAnsi="Arial"/>
+                <w:b w:val="false"/>
+                <w:bCs w:val="false"/>
+                <w:sz w:val="22"/>
+                <w:szCs w:val="22"/>
+              </w:rPr>
+              <w:t xml:space="preserve">где?</w:t>
+            </w:r>
+          </w:p>
+        </w:tc>
+        <w:tc>
+          <w:tcPr>
+            <w:tcW w:type="dxa" w:w="4338"/>
+            <w:tcBorders>
+              <w:top w:val="single" w:color="999999" w:sz="4"/>
+              <w:left w:val="single" w:color="999999" w:sz="4"/>
+              <w:bottom w:val="single" w:color="999999" w:sz="4"/>
+              <w:right w:val="single" w:color="999999" w:sz="4"/>
+            </w:tcBorders>
+            <w:tcMar>
+              <w:top w:type="dxa" w:w="80"/>
+              <w:left w:type="dxa" w:w="100"/>
+              <w:bottom w:type="dxa" w:w="80"/>
+              <w:right w:type="dxa" w:w="100"/>
+            </w:tcMar>
+          </w:tcPr>
+          <w:p>
+            <w:pPr>
+              <w:spacing w:after="0" w:before="0"/>
+            </w:pPr>
+            <w:r>
+              <w:rPr>
+                <w:rFonts w:ascii="Arial" w:cs="Arial" w:eastAsia="Arial" w:hAnsi="Arial"/>
+                <w:b w:val="false"/>
+                <w:bCs w:val="false"/>
+                <w:sz w:val="22"/>
+                <w:szCs w:val="22"/>
+              </w:rPr>
+              <w:t xml:space="preserve">Wo wohnst du?</w:t>
+            </w:r>
+          </w:p>
+        </w:tc>
+      </w:tr>
+      <w:tr>
+        <w:trPr>
+          <w:tblHeader w:val="false"/>
+        </w:trPr>
+        <w:tc>
+          <w:tcPr>
+            <w:tcW w:type="dxa" w:w="2900"/>
+            <w:tcBorders>
+              <w:top w:val="single" w:color="999999" w:sz="4"/>
+              <w:left w:val="single" w:color="999999" w:sz="4"/>
+              <w:bottom w:val="single" w:color="999999" w:sz="4"/>
+              <w:right w:val="single" w:color="999999" w:sz="4"/>
+            </w:tcBorders>
+            <w:shd w:fill="F7F7F7" w:color="auto" w:val="clear"/>
+            <w:tcMar>
+              <w:top w:type="dxa" w:w="80"/>
+              <w:left w:type="dxa" w:w="100"/>
+              <w:bottom w:type="dxa" w:w="80"/>
+              <w:right w:type="dxa" w:w="100"/>
+            </w:tcMar>
+          </w:tcPr>
+          <w:p>
+            <w:pPr>
+              <w:spacing w:after="0" w:before="0"/>
+            </w:pPr>
+            <w:r>
+              <w:rPr>
+                <w:rFonts w:ascii="Arial" w:cs="Arial" w:eastAsia="Arial" w:hAnsi="Arial"/>
+                <w:b/>
+                <w:bCs/>
+                <w:sz w:val="22"/>
+                <w:szCs w:val="22"/>
+              </w:rPr>
+              <w:t xml:space="preserve">woher?</w:t>
+            </w:r>
+          </w:p>
+        </w:tc>
+        <w:tc>
+          <w:tcPr>
+            <w:tcW w:type="dxa" w:w="2400"/>
+            <w:tcBorders>
+              <w:top w:val="single" w:color="999999" w:sz="4"/>
+              <w:left w:val="single" w:color="999999" w:sz="4"/>
+              <w:bottom w:val="single" w:color="999999" w:sz="4"/>
+              <w:right w:val="single" w:color="999999" w:sz="4"/>
+            </w:tcBorders>
+            <w:tcMar>
+              <w:top w:type="dxa" w:w="80"/>
+              <w:left w:type="dxa" w:w="100"/>
+              <w:bottom w:type="dxa" w:w="80"/>
+              <w:right w:type="dxa" w:w="100"/>
+            </w:tcMar>
+          </w:tcPr>
+          <w:p>
+            <w:pPr>
+              <w:spacing w:after="0" w:before="0"/>
+            </w:pPr>
+            <w:r>
+              <w:rPr>
+                <w:rFonts w:ascii="Arial" w:cs="Arial" w:eastAsia="Arial" w:hAnsi="Arial"/>
+                <w:b w:val="false"/>
+                <w:bCs w:val="false"/>
+                <w:sz w:val="22"/>
+                <w:szCs w:val="22"/>
+              </w:rPr>
+              <w:t xml:space="preserve">откуда?</w:t>
+            </w:r>
+          </w:p>
+        </w:tc>
+        <w:tc>
+          <w:tcPr>
+            <w:tcW w:type="dxa" w:w="4338"/>
+            <w:tcBorders>
+              <w:top w:val="single" w:color="999999" w:sz="4"/>
+              <w:left w:val="single" w:color="999999" w:sz="4"/>
+              <w:bottom w:val="single" w:color="999999" w:sz="4"/>
+              <w:right w:val="single" w:color="999999" w:sz="4"/>
+            </w:tcBorders>
+            <w:tcMar>
+              <w:top w:type="dxa" w:w="80"/>
+              <w:left w:type="dxa" w:w="100"/>
+              <w:bottom w:type="dxa" w:w="80"/>
+              <w:right w:type="dxa" w:w="100"/>
+            </w:tcMar>
+          </w:tcPr>
+          <w:p>
+            <w:pPr>
+              <w:spacing w:after="0" w:before="0"/>
+            </w:pPr>
+            <w:r>
+              <w:rPr>
+                <w:rFonts w:ascii="Arial" w:cs="Arial" w:eastAsia="Arial" w:hAnsi="Arial"/>
+                <w:b w:val="false"/>
+                <w:bCs w:val="false"/>
+                <w:sz w:val="22"/>
+                <w:szCs w:val="22"/>
+              </w:rPr>
+              <w:t xml:space="preserve">Woher kommen Sie?</w:t>
+            </w:r>
+          </w:p>
+        </w:tc>
+      </w:tr>
+      <w:tr>
+        <w:trPr>
+          <w:tblHeader w:val="false"/>
+        </w:trPr>
+        <w:tc>
+          <w:tcPr>
+            <w:tcW w:type="dxa" w:w="2900"/>
+            <w:tcBorders>
+              <w:top w:val="single" w:color="999999" w:sz="4"/>
+              <w:left w:val="single" w:color="999999" w:sz="4"/>
+              <w:bottom w:val="single" w:color="999999" w:sz="4"/>
+              <w:right w:val="single" w:color="999999" w:sz="4"/>
+            </w:tcBorders>
+            <w:shd w:fill="F7F7F7" w:color="auto" w:val="clear"/>
+            <w:tcMar>
+              <w:top w:type="dxa" w:w="80"/>
+              <w:left w:type="dxa" w:w="100"/>
+              <w:bottom w:type="dxa" w:w="80"/>
+              <w:right w:type="dxa" w:w="100"/>
+            </w:tcMar>
+          </w:tcPr>
+          <w:p>
+            <w:pPr>
+              <w:spacing w:after="0" w:before="0"/>
+            </w:pPr>
+            <w:r>
+              <w:rPr>
+                <w:rFonts w:ascii="Arial" w:cs="Arial" w:eastAsia="Arial" w:hAnsi="Arial"/>
+                <w:b/>
+                <w:bCs/>
+                <w:sz w:val="22"/>
+                <w:szCs w:val="22"/>
+              </w:rPr>
+              <w:t xml:space="preserve">wann?</w:t>
+            </w:r>
+          </w:p>
+        </w:tc>
+        <w:tc>
+          <w:tcPr>
+            <w:tcW w:type="dxa" w:w="2400"/>
+            <w:tcBorders>
+              <w:top w:val="single" w:color="999999" w:sz="4"/>
+              <w:left w:val="single" w:color="999999" w:sz="4"/>
+              <w:bottom w:val="single" w:color="999999" w:sz="4"/>
+              <w:right w:val="single" w:color="999999" w:sz="4"/>
+            </w:tcBorders>
+            <w:tcMar>
+              <w:top w:type="dxa" w:w="80"/>
+              <w:left w:type="dxa" w:w="100"/>
+              <w:bottom w:type="dxa" w:w="80"/>
+              <w:right w:type="dxa" w:w="100"/>
+            </w:tcMar>
+          </w:tcPr>
+          <w:p>
+            <w:pPr>
+              <w:spacing w:after="0" w:before="0"/>
+            </w:pPr>
+            <w:r>
+              <w:rPr>
+                <w:rFonts w:ascii="Arial" w:cs="Arial" w:eastAsia="Arial" w:hAnsi="Arial"/>
+                <w:b w:val="false"/>
+                <w:bCs w:val="false"/>
+                <w:sz w:val="22"/>
+                <w:szCs w:val="22"/>
+              </w:rPr>
+              <w:t xml:space="preserve">когда?</w:t>
+            </w:r>
+          </w:p>
+        </w:tc>
+        <w:tc>
+          <w:tcPr>
+            <w:tcW w:type="dxa" w:w="4338"/>
+            <w:tcBorders>
+              <w:top w:val="single" w:color="999999" w:sz="4"/>
+              <w:left w:val="single" w:color="999999" w:sz="4"/>
+              <w:bottom w:val="single" w:color="999999" w:sz="4"/>
+              <w:right w:val="single" w:color="999999" w:sz="4"/>
+            </w:tcBorders>
+            <w:tcMar>
+              <w:top w:type="dxa" w:w="80"/>
+              <w:left w:type="dxa" w:w="100"/>
+              <w:bottom w:type="dxa" w:w="80"/>
+              <w:right w:type="dxa" w:w="100"/>
+            </w:tcMar>
+          </w:tcPr>
+          <w:p>
+            <w:pPr>
+              <w:spacing w:after="0" w:before="0"/>
+            </w:pPr>
+            <w:r>
+              <w:rPr>
+                <w:rFonts w:ascii="Arial" w:cs="Arial" w:eastAsia="Arial" w:hAnsi="Arial"/>
+                <w:b w:val="false"/>
+                <w:bCs w:val="false"/>
+                <w:sz w:val="22"/>
+                <w:szCs w:val="22"/>
+              </w:rPr>
+              <w:t xml:space="preserve">Wann arbeitest du?</w:t>
+            </w:r>
+          </w:p>
+        </w:tc>
+      </w:tr>
+      <w:tr>
+        <w:trPr>
+          <w:tblHeader w:val="false"/>
+        </w:trPr>
+        <w:tc>
+          <w:tcPr>
+            <w:tcW w:type="dxa" w:w="2900"/>
+            <w:tcBorders>
+              <w:top w:val="single" w:color="999999" w:sz="4"/>
+              <w:left w:val="single" w:color="999999" w:sz="4"/>
+              <w:bottom w:val="single" w:color="999999" w:sz="4"/>
+              <w:right w:val="single" w:color="999999" w:sz="4"/>
+            </w:tcBorders>
+            <w:shd w:fill="F7F7F7" w:color="auto" w:val="clear"/>
+            <w:tcMar>
+              <w:top w:type="dxa" w:w="80"/>
+              <w:left w:type="dxa" w:w="100"/>
+              <w:bottom w:type="dxa" w:w="80"/>
+              <w:right w:type="dxa" w:w="100"/>
+            </w:tcMar>
+          </w:tcPr>
+          <w:p>
+            <w:pPr>
+              <w:spacing w:after="0" w:before="0"/>
+            </w:pPr>
+            <w:r>
+              <w:rPr>
+                <w:rFonts w:ascii="Arial" w:cs="Arial" w:eastAsia="Arial" w:hAnsi="Arial"/>
+                <w:b/>
+                <w:bCs/>
+                <w:sz w:val="22"/>
+                <w:szCs w:val="22"/>
+              </w:rPr>
+              <w:t xml:space="preserve">warum?</w:t>
+            </w:r>
+          </w:p>
+        </w:tc>
+        <w:tc>
+          <w:tcPr>
+            <w:tcW w:type="dxa" w:w="2400"/>
+            <w:tcBorders>
+              <w:top w:val="single" w:color="999999" w:sz="4"/>
+              <w:left w:val="single" w:color="999999" w:sz="4"/>
+              <w:bottom w:val="single" w:color="999999" w:sz="4"/>
+              <w:right w:val="single" w:color="999999" w:sz="4"/>
+            </w:tcBorders>
+            <w:tcMar>
+              <w:top w:type="dxa" w:w="80"/>
+              <w:left w:type="dxa" w:w="100"/>
+              <w:bottom w:type="dxa" w:w="80"/>
+              <w:right w:type="dxa" w:w="100"/>
+            </w:tcMar>
+          </w:tcPr>
+          <w:p>
+            <w:pPr>
+              <w:spacing w:after="0" w:before="0"/>
+            </w:pPr>
+            <w:r>
+              <w:rPr>
+                <w:rFonts w:ascii="Arial" w:cs="Arial" w:eastAsia="Arial" w:hAnsi="Arial"/>
+                <w:b w:val="false"/>
+                <w:bCs w:val="false"/>
+                <w:sz w:val="22"/>
+                <w:szCs w:val="22"/>
+              </w:rPr>
+              <w:t xml:space="preserve">почему?</w:t>
+            </w:r>
+          </w:p>
+        </w:tc>
+        <w:tc>
+          <w:tcPr>
+            <w:tcW w:type="dxa" w:w="4338"/>
+            <w:tcBorders>
+              <w:top w:val="single" w:color="999999" w:sz="4"/>
+              <w:left w:val="single" w:color="999999" w:sz="4"/>
+              <w:bottom w:val="single" w:color="999999" w:sz="4"/>
+              <w:right w:val="single" w:color="999999" w:sz="4"/>
+            </w:tcBorders>
+            <w:tcMar>
+              <w:top w:type="dxa" w:w="80"/>
+              <w:left w:type="dxa" w:w="100"/>
+              <w:bottom w:type="dxa" w:w="80"/>
+              <w:right w:type="dxa" w:w="100"/>
+            </w:tcMar>
+          </w:tcPr>
+          <w:p>
+            <w:pPr>
+              <w:spacing w:after="0" w:before="0"/>
+            </w:pPr>
+            <w:r>
+              <w:rPr>
+                <w:rFonts w:ascii="Arial" w:cs="Arial" w:eastAsia="Arial" w:hAnsi="Arial"/>
+                <w:b w:val="false"/>
+                <w:bCs w:val="false"/>
+                <w:sz w:val="22"/>
+                <w:szCs w:val="22"/>
+              </w:rPr>
+              <w:t xml:space="preserve">Warum lernst du Deutsch?</w:t>
+            </w:r>
+          </w:p>
+        </w:tc>
+      </w:tr>
+      <w:tr>
+        <w:trPr>
+          <w:tblHeader w:val="false"/>
+        </w:trPr>
+        <w:tc>
+          <w:tcPr>
+            <w:tcW w:type="dxa" w:w="2900"/>
+            <w:tcBorders>
+              <w:top w:val="single" w:color="999999" w:sz="4"/>
+              <w:left w:val="single" w:color="999999" w:sz="4"/>
+              <w:bottom w:val="single" w:color="999999" w:sz="4"/>
+              <w:right w:val="single" w:color="999999" w:sz="4"/>
+            </w:tcBorders>
+            <w:shd w:fill="F7F7F7" w:color="auto" w:val="clear"/>
+            <w:tcMar>
+              <w:top w:type="dxa" w:w="80"/>
+              <w:left w:type="dxa" w:w="100"/>
+              <w:bottom w:type="dxa" w:w="80"/>
+              <w:right w:type="dxa" w:w="100"/>
+            </w:tcMar>
+          </w:tcPr>
+          <w:p>
+            <w:pPr>
+              <w:spacing w:after="0" w:before="0"/>
+            </w:pPr>
+            <w:r>
+              <w:rPr>
+                <w:rFonts w:ascii="Arial" w:cs="Arial" w:eastAsia="Arial" w:hAnsi="Arial"/>
+                <w:b/>
+                <w:bCs/>
+                <w:sz w:val="22"/>
+                <w:szCs w:val="22"/>
+              </w:rPr>
+              <w:t xml:space="preserve">(das) Deutschland</w:t>
+            </w:r>
+          </w:p>
+        </w:tc>
+        <w:tc>
+          <w:tcPr>
+            <w:tcW w:type="dxa" w:w="2400"/>
+            <w:tcBorders>
+              <w:top w:val="single" w:color="999999" w:sz="4"/>
+              <w:left w:val="single" w:color="999999" w:sz="4"/>
+              <w:bottom w:val="single" w:color="999999" w:sz="4"/>
+              <w:right w:val="single" w:color="999999" w:sz="4"/>
+            </w:tcBorders>
+            <w:tcMar>
+              <w:top w:type="dxa" w:w="80"/>
+              <w:left w:type="dxa" w:w="100"/>
+              <w:bottom w:type="dxa" w:w="80"/>
+              <w:right w:type="dxa" w:w="100"/>
+            </w:tcMar>
+          </w:tcPr>
+          <w:p>
+            <w:pPr>
+              <w:spacing w:after="0" w:before="0"/>
+            </w:pPr>
+            <w:r>
+              <w:rPr>
+                <w:rFonts w:ascii="Arial" w:cs="Arial" w:eastAsia="Arial" w:hAnsi="Arial"/>
+                <w:b w:val="false"/>
+                <w:bCs w:val="false"/>
+                <w:sz w:val="22"/>
+                <w:szCs w:val="22"/>
+              </w:rPr>
+              <w:t xml:space="preserve">Германия</w:t>
+            </w:r>
+          </w:p>
+        </w:tc>
+        <w:tc>
+          <w:tcPr>
+            <w:tcW w:type="dxa" w:w="4338"/>
+            <w:tcBorders>
+              <w:top w:val="single" w:color="999999" w:sz="4"/>
+              <w:left w:val="single" w:color="999999" w:sz="4"/>
+              <w:bottom w:val="single" w:color="999999" w:sz="4"/>
+              <w:right w:val="single" w:color="999999" w:sz="4"/>
+            </w:tcBorders>
+            <w:tcMar>
+              <w:top w:type="dxa" w:w="80"/>
+              <w:left w:type="dxa" w:w="100"/>
+              <w:bottom w:type="dxa" w:w="80"/>
+              <w:right w:type="dxa" w:w="100"/>
+            </w:tcMar>
+          </w:tcPr>
+          <w:p>
+            <w:pPr>
+              <w:spacing w:after="0" w:before="0"/>
+            </w:pPr>
+            <w:r>
+              <w:rPr>
+                <w:rFonts w:ascii="Arial" w:cs="Arial" w:eastAsia="Arial" w:hAnsi="Arial"/>
+                <w:b w:val="false"/>
+                <w:bCs w:val="false"/>
+                <w:sz w:val="22"/>
+                <w:szCs w:val="22"/>
+              </w:rPr>
+              <w:t xml:space="preserve">Ich komme aus Deutschland.</w:t>
+            </w:r>
+          </w:p>
+        </w:tc>
+      </w:tr>
+      <w:tr>
+        <w:trPr>
+          <w:tblHeader w:val="false"/>
+        </w:trPr>
+        <w:tc>
+          <w:tcPr>
+            <w:tcW w:type="dxa" w:w="2900"/>
+            <w:tcBorders>
+              <w:top w:val="single" w:color="999999" w:sz="4"/>
+              <w:left w:val="single" w:color="999999" w:sz="4"/>
+              <w:bottom w:val="single" w:color="999999" w:sz="4"/>
+              <w:right w:val="single" w:color="999999" w:sz="4"/>
+            </w:tcBorders>
+            <w:shd w:fill="F7F7F7" w:color="auto" w:val="clear"/>
+            <w:tcMar>
+              <w:top w:type="dxa" w:w="80"/>
+              <w:left w:type="dxa" w:w="100"/>
+              <w:bottom w:type="dxa" w:w="80"/>
+              <w:right w:type="dxa" w:w="100"/>
+            </w:tcMar>
+          </w:tcPr>
+          <w:p>
+            <w:pPr>
+              <w:spacing w:after="0" w:before="0"/>
+            </w:pPr>
+            <w:r>
+              <w:rPr>
+                <w:rFonts w:ascii="Arial" w:cs="Arial" w:eastAsia="Arial" w:hAnsi="Arial"/>
+                <w:b/>
+                <w:bCs/>
+                <w:sz w:val="22"/>
+                <w:szCs w:val="22"/>
+              </w:rPr>
+              <w:t xml:space="preserve">(das) Österreich</w:t>
+            </w:r>
+          </w:p>
+        </w:tc>
+        <w:tc>
+          <w:tcPr>
+            <w:tcW w:type="dxa" w:w="2400"/>
+            <w:tcBorders>
+              <w:top w:val="single" w:color="999999" w:sz="4"/>
+              <w:left w:val="single" w:color="999999" w:sz="4"/>
+              <w:bottom w:val="single" w:color="999999" w:sz="4"/>
+              <w:right w:val="single" w:color="999999" w:sz="4"/>
+            </w:tcBorders>
+            <w:tcMar>
+              <w:top w:type="dxa" w:w="80"/>
+              <w:left w:type="dxa" w:w="100"/>
+              <w:bottom w:type="dxa" w:w="80"/>
+              <w:right w:type="dxa" w:w="100"/>
+            </w:tcMar>
+          </w:tcPr>
+          <w:p>
+            <w:pPr>
+              <w:spacing w:after="0" w:before="0"/>
+            </w:pPr>
+            <w:r>
+              <w:rPr>
+                <w:rFonts w:ascii="Arial" w:cs="Arial" w:eastAsia="Arial" w:hAnsi="Arial"/>
+                <w:b w:val="false"/>
+                <w:bCs w:val="false"/>
+                <w:sz w:val="22"/>
+                <w:szCs w:val="22"/>
+              </w:rPr>
+              <w:t xml:space="preserve">Австрия</w:t>
+            </w:r>
+          </w:p>
+        </w:tc>
+        <w:tc>
+          <w:tcPr>
+            <w:tcW w:type="dxa" w:w="4338"/>
+            <w:tcBorders>
+              <w:top w:val="single" w:color="999999" w:sz="4"/>
+              <w:left w:val="single" w:color="999999" w:sz="4"/>
+              <w:bottom w:val="single" w:color="999999" w:sz="4"/>
+              <w:right w:val="single" w:color="999999" w:sz="4"/>
+            </w:tcBorders>
+            <w:tcMar>
+              <w:top w:type="dxa" w:w="80"/>
+              <w:left w:type="dxa" w:w="100"/>
+              <w:bottom w:type="dxa" w:w="80"/>
+              <w:right w:type="dxa" w:w="100"/>
+            </w:tcMar>
+          </w:tcPr>
+          <w:p>
+            <w:pPr>
+              <w:spacing w:after="0" w:before="0"/>
+            </w:pPr>
+            <w:r>
+              <w:rPr>
+                <w:rFonts w:ascii="Arial" w:cs="Arial" w:eastAsia="Arial" w:hAnsi="Arial"/>
+                <w:b w:val="false"/>
+                <w:bCs w:val="false"/>
+                <w:sz w:val="22"/>
+                <w:szCs w:val="22"/>
+              </w:rPr>
+              <w:t xml:space="preserve">Er kommt aus Österreich.</w:t>
+            </w:r>
+          </w:p>
+        </w:tc>
+      </w:tr>
+      <w:tr>
+        <w:trPr>
+          <w:tblHeader w:val="false"/>
+        </w:trPr>
+        <w:tc>
+          <w:tcPr>
+            <w:tcW w:type="dxa" w:w="2900"/>
+            <w:tcBorders>
+              <w:top w:val="single" w:color="999999" w:sz="4"/>
+              <w:left w:val="single" w:color="999999" w:sz="4"/>
+              <w:bottom w:val="single" w:color="999999" w:sz="4"/>
+              <w:right w:val="single" w:color="999999" w:sz="4"/>
+            </w:tcBorders>
+            <w:shd w:fill="F7F7F7" w:color="auto" w:val="clear"/>
+            <w:tcMar>
+              <w:top w:type="dxa" w:w="80"/>
+              <w:left w:type="dxa" w:w="100"/>
+              <w:bottom w:type="dxa" w:w="80"/>
+              <w:right w:type="dxa" w:w="100"/>
+            </w:tcMar>
+          </w:tcPr>
+          <w:p>
+            <w:pPr>
+              <w:spacing w:after="0" w:before="0"/>
+            </w:pPr>
+            <w:r>
+              <w:rPr>
+                <w:rFonts w:ascii="Arial" w:cs="Arial" w:eastAsia="Arial" w:hAnsi="Arial"/>
+                <w:b/>
+                <w:bCs/>
+                <w:sz w:val="22"/>
+                <w:szCs w:val="22"/>
+              </w:rPr>
+              <w:t xml:space="preserve">die Schweiz</w:t>
+            </w:r>
+          </w:p>
+        </w:tc>
+        <w:tc>
+          <w:tcPr>
+            <w:tcW w:type="dxa" w:w="2400"/>
+            <w:tcBorders>
+              <w:top w:val="single" w:color="999999" w:sz="4"/>
+              <w:left w:val="single" w:color="999999" w:sz="4"/>
+              <w:bottom w:val="single" w:color="999999" w:sz="4"/>
+              <w:right w:val="single" w:color="999999" w:sz="4"/>
+            </w:tcBorders>
+            <w:tcMar>
+              <w:top w:type="dxa" w:w="80"/>
+              <w:left w:type="dxa" w:w="100"/>
+              <w:bottom w:type="dxa" w:w="80"/>
+              <w:right w:type="dxa" w:w="100"/>
+            </w:tcMar>
+          </w:tcPr>
+          <w:p>
+            <w:pPr>
+              <w:spacing w:after="0" w:before="0"/>
+            </w:pPr>
+            <w:r>
+              <w:rPr>
+                <w:rFonts w:ascii="Arial" w:cs="Arial" w:eastAsia="Arial" w:hAnsi="Arial"/>
+                <w:b w:val="false"/>
+                <w:bCs w:val="false"/>
+                <w:sz w:val="22"/>
+                <w:szCs w:val="22"/>
+              </w:rPr>
+              <w:t xml:space="preserve">Швейцария</w:t>
+            </w:r>
+          </w:p>
+        </w:tc>
+        <w:tc>
+          <w:tcPr>
+            <w:tcW w:type="dxa" w:w="4338"/>
+            <w:tcBorders>
+              <w:top w:val="single" w:color="999999" w:sz="4"/>
+              <w:left w:val="single" w:color="999999" w:sz="4"/>
+              <w:bottom w:val="single" w:color="999999" w:sz="4"/>
+              <w:right w:val="single" w:color="999999" w:sz="4"/>
+            </w:tcBorders>
+            <w:tcMar>
+              <w:top w:type="dxa" w:w="80"/>
+              <w:left w:type="dxa" w:w="100"/>
+              <w:bottom w:type="dxa" w:w="80"/>
+              <w:right w:type="dxa" w:w="100"/>
+            </w:tcMar>
+          </w:tcPr>
+          <w:p>
+            <w:pPr>
+              <w:spacing w:after="0" w:before="0"/>
+            </w:pPr>
+            <w:r>
+              <w:rPr>
+                <w:rFonts w:ascii="Arial" w:cs="Arial" w:eastAsia="Arial" w:hAnsi="Arial"/>
+                <w:b w:val="false"/>
+                <w:bCs w:val="false"/>
+                <w:sz w:val="22"/>
+                <w:szCs w:val="22"/>
+              </w:rPr>
+              <w:t xml:space="preserve">Ich komme aus der Schweiz.</w:t>
+            </w:r>
+          </w:p>
+        </w:tc>
+      </w:tr>
+      <w:tr>
+        <w:trPr>
+          <w:tblHeader w:val="false"/>
+        </w:trPr>
+        <w:tc>
+          <w:tcPr>
+            <w:tcW w:type="dxa" w:w="2900"/>
+            <w:tcBorders>
+              <w:top w:val="single" w:color="999999" w:sz="4"/>
+              <w:left w:val="single" w:color="999999" w:sz="4"/>
+              <w:bottom w:val="single" w:color="999999" w:sz="4"/>
+              <w:right w:val="single" w:color="999999" w:sz="4"/>
+            </w:tcBorders>
+            <w:shd w:fill="F7F7F7" w:color="auto" w:val="clear"/>
+            <w:tcMar>
+              <w:top w:type="dxa" w:w="80"/>
+              <w:left w:type="dxa" w:w="100"/>
+              <w:bottom w:type="dxa" w:w="80"/>
+              <w:right w:type="dxa" w:w="100"/>
+            </w:tcMar>
+          </w:tcPr>
+          <w:p>
+            <w:pPr>
+              <w:spacing w:after="0" w:before="0"/>
+            </w:pPr>
+            <w:r>
+              <w:rPr>
+                <w:rFonts w:ascii="Arial" w:cs="Arial" w:eastAsia="Arial" w:hAnsi="Arial"/>
+                <w:b/>
+                <w:bCs/>
+                <w:sz w:val="22"/>
+                <w:szCs w:val="22"/>
+              </w:rPr>
+              <w:t xml:space="preserve">(das) Russland</w:t>
+            </w:r>
+          </w:p>
+        </w:tc>
+        <w:tc>
+          <w:tcPr>
+            <w:tcW w:type="dxa" w:w="2400"/>
+            <w:tcBorders>
+              <w:top w:val="single" w:color="999999" w:sz="4"/>
+              <w:left w:val="single" w:color="999999" w:sz="4"/>
+              <w:bottom w:val="single" w:color="999999" w:sz="4"/>
+              <w:right w:val="single" w:color="999999" w:sz="4"/>
+            </w:tcBorders>
+            <w:tcMar>
+              <w:top w:type="dxa" w:w="80"/>
+              <w:left w:type="dxa" w:w="100"/>
+              <w:bottom w:type="dxa" w:w="80"/>
+              <w:right w:type="dxa" w:w="100"/>
+            </w:tcMar>
+          </w:tcPr>
+          <w:p>
+            <w:pPr>
+              <w:spacing w:after="0" w:before="0"/>
+            </w:pPr>
+            <w:r>
+              <w:rPr>
+                <w:rFonts w:ascii="Arial" w:cs="Arial" w:eastAsia="Arial" w:hAnsi="Arial"/>
+                <w:b w:val="false"/>
+                <w:bCs w:val="false"/>
+                <w:sz w:val="22"/>
+                <w:szCs w:val="22"/>
+              </w:rPr>
+              <w:t xml:space="preserve">Россия</w:t>
+            </w:r>
+          </w:p>
+        </w:tc>
+        <w:tc>
+          <w:tcPr>
+            <w:tcW w:type="dxa" w:w="4338"/>
+            <w:tcBorders>
+              <w:top w:val="single" w:color="999999" w:sz="4"/>
+              <w:left w:val="single" w:color="999999" w:sz="4"/>
+              <w:bottom w:val="single" w:color="999999" w:sz="4"/>
+              <w:right w:val="single" w:color="999999" w:sz="4"/>
+            </w:tcBorders>
+            <w:tcMar>
+              <w:top w:type="dxa" w:w="80"/>
+              <w:left w:type="dxa" w:w="100"/>
+              <w:bottom w:type="dxa" w:w="80"/>
+              <w:right w:type="dxa" w:w="100"/>
+            </w:tcMar>
+          </w:tcPr>
+          <w:p>
+            <w:pPr>
+              <w:spacing w:after="0" w:before="0"/>
+            </w:pPr>
+            <w:r>
+              <w:rPr>
+                <w:rFonts w:ascii="Arial" w:cs="Arial" w:eastAsia="Arial" w:hAnsi="Arial"/>
+                <w:b w:val="false"/>
+                <w:bCs w:val="false"/>
+                <w:sz w:val="22"/>
+                <w:szCs w:val="22"/>
+              </w:rPr>
+              <w:t xml:space="preserve">Ich komme aus Russland.</w:t>
+            </w:r>
+          </w:p>
+        </w:tc>
+      </w:tr>
+      <w:tr>
+        <w:trPr>
+          <w:tblHeader w:val="false"/>
+        </w:trPr>
+        <w:tc>
+          <w:tcPr>
+            <w:tcW w:type="dxa" w:w="2900"/>
+            <w:tcBorders>
+              <w:top w:val="single" w:color="999999" w:sz="4"/>
+              <w:left w:val="single" w:color="999999" w:sz="4"/>
+              <w:bottom w:val="single" w:color="999999" w:sz="4"/>
+              <w:right w:val="single" w:color="999999" w:sz="4"/>
+            </w:tcBorders>
+            <w:shd w:fill="F7F7F7" w:color="auto" w:val="clear"/>
+            <w:tcMar>
+              <w:top w:type="dxa" w:w="80"/>
+              <w:left w:type="dxa" w:w="100"/>
+              <w:bottom w:type="dxa" w:w="80"/>
+              <w:right w:type="dxa" w:w="100"/>
+            </w:tcMar>
+          </w:tcPr>
+          <w:p>
+            <w:pPr>
+              <w:spacing w:after="0" w:before="0"/>
+            </w:pPr>
+            <w:r>
+              <w:rPr>
+                <w:rFonts w:ascii="Arial" w:cs="Arial" w:eastAsia="Arial" w:hAnsi="Arial"/>
+                <w:b/>
+                <w:bCs/>
+                <w:sz w:val="22"/>
+                <w:szCs w:val="22"/>
+              </w:rPr>
+              <w:t xml:space="preserve">die Ukraine</w:t>
+            </w:r>
+          </w:p>
+        </w:tc>
+        <w:tc>
+          <w:tcPr>
+            <w:tcW w:type="dxa" w:w="2400"/>
+            <w:tcBorders>
+              <w:top w:val="single" w:color="999999" w:sz="4"/>
+              <w:left w:val="single" w:color="999999" w:sz="4"/>
+              <w:bottom w:val="single" w:color="999999" w:sz="4"/>
+              <w:right w:val="single" w:color="999999" w:sz="4"/>
+            </w:tcBorders>
+            <w:tcMar>
+              <w:top w:type="dxa" w:w="80"/>
+              <w:left w:type="dxa" w:w="100"/>
+              <w:bottom w:type="dxa" w:w="80"/>
+              <w:right w:type="dxa" w:w="100"/>
+            </w:tcMar>
+          </w:tcPr>
+          <w:p>
+            <w:pPr>
+              <w:spacing w:after="0" w:before="0"/>
+            </w:pPr>
+            <w:r>
+              <w:rPr>
+                <w:rFonts w:ascii="Arial" w:cs="Arial" w:eastAsia="Arial" w:hAnsi="Arial"/>
+                <w:b w:val="false"/>
+                <w:bCs w:val="false"/>
+                <w:sz w:val="22"/>
+                <w:szCs w:val="22"/>
+              </w:rPr>
+              <w:t xml:space="preserve">Украина</w:t>
+            </w:r>
+          </w:p>
+        </w:tc>
+        <w:tc>
+          <w:tcPr>
+            <w:tcW w:type="dxa" w:w="4338"/>
+            <w:tcBorders>
+              <w:top w:val="single" w:color="999999" w:sz="4"/>
+              <w:left w:val="single" w:color="999999" w:sz="4"/>
+              <w:bottom w:val="single" w:color="999999" w:sz="4"/>
+              <w:right w:val="single" w:color="999999" w:sz="4"/>
+            </w:tcBorders>
+            <w:tcMar>
+              <w:top w:type="dxa" w:w="80"/>
+              <w:left w:type="dxa" w:w="100"/>
+              <w:bottom w:type="dxa" w:w="80"/>
+              <w:right w:type="dxa" w:w="100"/>
+            </w:tcMar>
+          </w:tcPr>
+          <w:p>
+            <w:pPr>
+              <w:spacing w:after="0" w:before="0"/>
+            </w:pPr>
+            <w:r>
+              <w:rPr>
+                <w:rFonts w:ascii="Arial" w:cs="Arial" w:eastAsia="Arial" w:hAnsi="Arial"/>
+                <w:b w:val="false"/>
+                <w:bCs w:val="false"/>
+                <w:sz w:val="22"/>
+                <w:szCs w:val="22"/>
+              </w:rPr>
+              <w:t xml:space="preserve">Er kommt aus der Ukraine.</w:t>
+            </w:r>
+          </w:p>
+        </w:tc>
+      </w:tr>
+      <w:tr>
+        <w:trPr>
+          <w:tblHeader w:val="false"/>
+        </w:trPr>
+        <w:tc>
+          <w:tcPr>
+            <w:tcW w:type="dxa" w:w="2900"/>
+            <w:tcBorders>
+              <w:top w:val="single" w:color="999999" w:sz="4"/>
+              <w:left w:val="single" w:color="999999" w:sz="4"/>
+              <w:bottom w:val="single" w:color="999999" w:sz="4"/>
+              <w:right w:val="single" w:color="999999" w:sz="4"/>
+            </w:tcBorders>
+            <w:shd w:fill="F7F7F7" w:color="auto" w:val="clear"/>
+            <w:tcMar>
+              <w:top w:type="dxa" w:w="80"/>
+              <w:left w:type="dxa" w:w="100"/>
+              <w:bottom w:type="dxa" w:w="80"/>
+              <w:right w:type="dxa" w:w="100"/>
+            </w:tcMar>
+          </w:tcPr>
+          <w:p>
+            <w:pPr>
+              <w:spacing w:after="0" w:before="0"/>
+            </w:pPr>
+            <w:r>
+              <w:rPr>
+                <w:rFonts w:ascii="Arial" w:cs="Arial" w:eastAsia="Arial" w:hAnsi="Arial"/>
+                <w:b/>
+                <w:bCs/>
+                <w:sz w:val="22"/>
+                <w:szCs w:val="22"/>
+              </w:rPr>
+              <w:t xml:space="preserve">(das) Deutsch</w:t>
+            </w:r>
+          </w:p>
+        </w:tc>
+        <w:tc>
+          <w:tcPr>
+            <w:tcW w:type="dxa" w:w="2400"/>
+            <w:tcBorders>
+              <w:top w:val="single" w:color="999999" w:sz="4"/>
+              <w:left w:val="single" w:color="999999" w:sz="4"/>
+              <w:bottom w:val="single" w:color="999999" w:sz="4"/>
+              <w:right w:val="single" w:color="999999" w:sz="4"/>
+            </w:tcBorders>
+            <w:tcMar>
+              <w:top w:type="dxa" w:w="80"/>
+              <w:left w:type="dxa" w:w="100"/>
+              <w:bottom w:type="dxa" w:w="80"/>
+              <w:right w:type="dxa" w:w="100"/>
+            </w:tcMar>
+          </w:tcPr>
+          <w:p>
+            <w:pPr>
+              <w:spacing w:after="0" w:before="0"/>
+            </w:pPr>
+            <w:r>
+              <w:rPr>
+                <w:rFonts w:ascii="Arial" w:cs="Arial" w:eastAsia="Arial" w:hAnsi="Arial"/>
+                <w:b w:val="false"/>
+                <w:bCs w:val="false"/>
+                <w:sz w:val="22"/>
+                <w:szCs w:val="22"/>
+              </w:rPr>
+              <w:t xml:space="preserve">немецкий (язык)</w:t>
+            </w:r>
+          </w:p>
+        </w:tc>
+        <w:tc>
+          <w:tcPr>
+            <w:tcW w:type="dxa" w:w="4338"/>
+            <w:tcBorders>
+              <w:top w:val="single" w:color="999999" w:sz="4"/>
+              <w:left w:val="single" w:color="999999" w:sz="4"/>
+              <w:bottom w:val="single" w:color="999999" w:sz="4"/>
+              <w:right w:val="single" w:color="999999" w:sz="4"/>
+            </w:tcBorders>
+            <w:tcMar>
+              <w:top w:type="dxa" w:w="80"/>
+              <w:left w:type="dxa" w:w="100"/>
+              <w:bottom w:type="dxa" w:w="80"/>
+              <w:right w:type="dxa" w:w="100"/>
+            </w:tcMar>
+          </w:tcPr>
+          <w:p>
+            <w:pPr>
+              <w:spacing w:after="0" w:before="0"/>
+            </w:pPr>
+            <w:r>
+              <w:rPr>
+                <w:rFonts w:ascii="Arial" w:cs="Arial" w:eastAsia="Arial" w:hAnsi="Arial"/>
+                <w:b w:val="false"/>
+                <w:bCs w:val="false"/>
+                <w:sz w:val="22"/>
+                <w:szCs w:val="22"/>
+              </w:rPr>
+              <w:t xml:space="preserve">Ich lerne Deutsch.</w:t>
+            </w:r>
+          </w:p>
+        </w:tc>
+      </w:tr>
+      <w:tr>
+        <w:trPr>
+          <w:tblHeader w:val="false"/>
+        </w:trPr>
+        <w:tc>
+          <w:tcPr>
+            <w:tcW w:type="dxa" w:w="2900"/>
+            <w:tcBorders>
+              <w:top w:val="single" w:color="999999" w:sz="4"/>
+              <w:left w:val="single" w:color="999999" w:sz="4"/>
+              <w:bottom w:val="single" w:color="999999" w:sz="4"/>
+              <w:right w:val="single" w:color="999999" w:sz="4"/>
+            </w:tcBorders>
+            <w:shd w:fill="F7F7F7" w:color="auto" w:val="clear"/>
+            <w:tcMar>
+              <w:top w:type="dxa" w:w="80"/>
+              <w:left w:type="dxa" w:w="100"/>
+              <w:bottom w:type="dxa" w:w="80"/>
+              <w:right w:type="dxa" w:w="100"/>
+            </w:tcMar>
+          </w:tcPr>
+          <w:p>
+            <w:pPr>
+              <w:spacing w:after="0" w:before="0"/>
+            </w:pPr>
+            <w:r>
+              <w:rPr>
+                <w:rFonts w:ascii="Arial" w:cs="Arial" w:eastAsia="Arial" w:hAnsi="Arial"/>
+                <w:b/>
+                <w:bCs/>
+                <w:sz w:val="22"/>
+                <w:szCs w:val="22"/>
+              </w:rPr>
+              <w:t xml:space="preserve">(das) Russisch</w:t>
+            </w:r>
+          </w:p>
+        </w:tc>
+        <w:tc>
+          <w:tcPr>
+            <w:tcW w:type="dxa" w:w="2400"/>
+            <w:tcBorders>
+              <w:top w:val="single" w:color="999999" w:sz="4"/>
+              <w:left w:val="single" w:color="999999" w:sz="4"/>
+              <w:bottom w:val="single" w:color="999999" w:sz="4"/>
+              <w:right w:val="single" w:color="999999" w:sz="4"/>
+            </w:tcBorders>
+            <w:tcMar>
+              <w:top w:type="dxa" w:w="80"/>
+              <w:left w:type="dxa" w:w="100"/>
+              <w:bottom w:type="dxa" w:w="80"/>
+              <w:right w:type="dxa" w:w="100"/>
+            </w:tcMar>
+          </w:tcPr>
+          <w:p>
+            <w:pPr>
+              <w:spacing w:after="0" w:before="0"/>
+            </w:pPr>
+            <w:r>
+              <w:rPr>
+                <w:rFonts w:ascii="Arial" w:cs="Arial" w:eastAsia="Arial" w:hAnsi="Arial"/>
+                <w:b w:val="false"/>
+                <w:bCs w:val="false"/>
+                <w:sz w:val="22"/>
+                <w:szCs w:val="22"/>
+              </w:rPr>
+              <w:t xml:space="preserve">русский (язык)</w:t>
+            </w:r>
+          </w:p>
+        </w:tc>
+        <w:tc>
+          <w:tcPr>
+            <w:tcW w:type="dxa" w:w="4338"/>
+            <w:tcBorders>
+              <w:top w:val="single" w:color="999999" w:sz="4"/>
+              <w:left w:val="single" w:color="999999" w:sz="4"/>
+              <w:bottom w:val="single" w:color="999999" w:sz="4"/>
+              <w:right w:val="single" w:color="999999" w:sz="4"/>
+            </w:tcBorders>
+            <w:tcMar>
+              <w:top w:type="dxa" w:w="80"/>
+              <w:left w:type="dxa" w:w="100"/>
+              <w:bottom w:type="dxa" w:w="80"/>
+              <w:right w:type="dxa" w:w="100"/>
+            </w:tcMar>
+          </w:tcPr>
+          <w:p>
+            <w:pPr>
+              <w:spacing w:after="0" w:before="0"/>
+            </w:pPr>
+            <w:r>
+              <w:rPr>
+                <w:rFonts w:ascii="Arial" w:cs="Arial" w:eastAsia="Arial" w:hAnsi="Arial"/>
+                <w:b w:val="false"/>
+                <w:bCs w:val="false"/>
+                <w:sz w:val="22"/>
+                <w:szCs w:val="22"/>
+              </w:rPr>
+              <w:t xml:space="preserve">Sie spricht Russisch.</w:t>
+            </w:r>
+          </w:p>
+        </w:tc>
+      </w:tr>
+      <w:tr>
+        <w:trPr>
+          <w:tblHeader w:val="false"/>
+        </w:trPr>
+        <w:tc>
+          <w:tcPr>
+            <w:tcW w:type="dxa" w:w="2900"/>
+            <w:tcBorders>
+              <w:top w:val="single" w:color="999999" w:sz="4"/>
+              <w:left w:val="single" w:color="999999" w:sz="4"/>
+              <w:bottom w:val="single" w:color="999999" w:sz="4"/>
+              <w:right w:val="single" w:color="999999" w:sz="4"/>
+            </w:tcBorders>
+            <w:shd w:fill="F7F7F7" w:color="auto" w:val="clear"/>
+            <w:tcMar>
+              <w:top w:type="dxa" w:w="80"/>
+              <w:left w:type="dxa" w:w="100"/>
+              <w:bottom w:type="dxa" w:w="80"/>
+              <w:right w:type="dxa" w:w="100"/>
+            </w:tcMar>
+          </w:tcPr>
+          <w:p>
+            <w:pPr>
+              <w:spacing w:after="0" w:before="0"/>
+            </w:pPr>
+            <w:r>
+              <w:rPr>
+                <w:rFonts w:ascii="Arial" w:cs="Arial" w:eastAsia="Arial" w:hAnsi="Arial"/>
+                <w:b/>
+                <w:bCs/>
+                <w:sz w:val="22"/>
+                <w:szCs w:val="22"/>
+              </w:rPr>
+              <w:t xml:space="preserve">(das) Englisch</w:t>
+            </w:r>
+          </w:p>
+        </w:tc>
+        <w:tc>
+          <w:tcPr>
+            <w:tcW w:type="dxa" w:w="2400"/>
+            <w:tcBorders>
+              <w:top w:val="single" w:color="999999" w:sz="4"/>
+              <w:left w:val="single" w:color="999999" w:sz="4"/>
+              <w:bottom w:val="single" w:color="999999" w:sz="4"/>
+              <w:right w:val="single" w:color="999999" w:sz="4"/>
+            </w:tcBorders>
+            <w:tcMar>
+              <w:top w:type="dxa" w:w="80"/>
+              <w:left w:type="dxa" w:w="100"/>
+              <w:bottom w:type="dxa" w:w="80"/>
+              <w:right w:type="dxa" w:w="100"/>
+            </w:tcMar>
+          </w:tcPr>
+          <w:p>
+            <w:pPr>
+              <w:spacing w:after="0" w:before="0"/>
+            </w:pPr>
+            <w:r>
+              <w:rPr>
+                <w:rFonts w:ascii="Arial" w:cs="Arial" w:eastAsia="Arial" w:hAnsi="Arial"/>
+                <w:b w:val="false"/>
+                <w:bCs w:val="false"/>
+                <w:sz w:val="22"/>
+                <w:szCs w:val="22"/>
+              </w:rPr>
+              <w:t xml:space="preserve">английский (язык)</w:t>
+            </w:r>
+          </w:p>
+        </w:tc>
+        <w:tc>
+          <w:tcPr>
+            <w:tcW w:type="dxa" w:w="4338"/>
+            <w:tcBorders>
+              <w:top w:val="single" w:color="999999" w:sz="4"/>
+              <w:left w:val="single" w:color="999999" w:sz="4"/>
+              <w:bottom w:val="single" w:color="999999" w:sz="4"/>
+              <w:right w:val="single" w:color="999999" w:sz="4"/>
+            </w:tcBorders>
+            <w:tcMar>
+              <w:top w:type="dxa" w:w="80"/>
+              <w:left w:type="dxa" w:w="100"/>
+              <w:bottom w:type="dxa" w:w="80"/>
+              <w:right w:type="dxa" w:w="100"/>
+            </w:tcMar>
+          </w:tcPr>
+          <w:p>
+            <w:pPr>
+              <w:spacing w:after="0" w:before="0"/>
+            </w:pPr>
+            <w:r>
+              <w:rPr>
+                <w:rFonts w:ascii="Arial" w:cs="Arial" w:eastAsia="Arial" w:hAnsi="Arial"/>
+                <w:b w:val="false"/>
+                <w:bCs w:val="false"/>
+                <w:sz w:val="22"/>
+                <w:szCs w:val="22"/>
+              </w:rPr>
+              <w:t xml:space="preserve">Wir lernen Englisch.</w:t>
+            </w:r>
+          </w:p>
+        </w:tc>
+      </w:tr>
+      <w:tr>
+        <w:trPr>
+          <w:tblHeader w:val="false"/>
+        </w:trPr>
+        <w:tc>
+          <w:tcPr>
+            <w:tcW w:type="dxa" w:w="2900"/>
+            <w:tcBorders>
+              <w:top w:val="single" w:color="999999" w:sz="4"/>
+              <w:left w:val="single" w:color="999999" w:sz="4"/>
+              <w:bottom w:val="single" w:color="999999" w:sz="4"/>
+              <w:right w:val="single" w:color="999999" w:sz="4"/>
+            </w:tcBorders>
+            <w:shd w:fill="F7F7F7" w:color="auto" w:val="clear"/>
+            <w:tcMar>
+              <w:top w:type="dxa" w:w="80"/>
+              <w:left w:type="dxa" w:w="100"/>
+              <w:bottom w:type="dxa" w:w="80"/>
+              <w:right w:type="dxa" w:w="100"/>
+            </w:tcMar>
+          </w:tcPr>
+          <w:p>
+            <w:pPr>
+              <w:spacing w:after="0" w:before="0"/>
+            </w:pPr>
+            <w:r>
+              <w:rPr>
+                <w:rFonts w:ascii="Arial" w:cs="Arial" w:eastAsia="Arial" w:hAnsi="Arial"/>
+                <w:b/>
+                <w:bCs/>
+                <w:sz w:val="22"/>
+                <w:szCs w:val="22"/>
+              </w:rPr>
+              <w:t xml:space="preserve">sprechen</w:t>
+            </w:r>
+          </w:p>
+        </w:tc>
+        <w:tc>
+          <w:tcPr>
+            <w:tcW w:type="dxa" w:w="2400"/>
+            <w:tcBorders>
+              <w:top w:val="single" w:color="999999" w:sz="4"/>
+              <w:left w:val="single" w:color="999999" w:sz="4"/>
+              <w:bottom w:val="single" w:color="999999" w:sz="4"/>
+              <w:right w:val="single" w:color="999999" w:sz="4"/>
+            </w:tcBorders>
+            <w:tcMar>
+              <w:top w:type="dxa" w:w="80"/>
+              <w:left w:type="dxa" w:w="100"/>
+              <w:bottom w:type="dxa" w:w="80"/>
+              <w:right w:type="dxa" w:w="100"/>
+            </w:tcMar>
+          </w:tcPr>
+          <w:p>
+            <w:pPr>
+              <w:spacing w:after="0" w:before="0"/>
+            </w:pPr>
+            <w:r>
+              <w:rPr>
+                <w:rFonts w:ascii="Arial" w:cs="Arial" w:eastAsia="Arial" w:hAnsi="Arial"/>
+                <w:b w:val="false"/>
+                <w:bCs w:val="false"/>
+                <w:sz w:val="22"/>
+                <w:szCs w:val="22"/>
+              </w:rPr>
+              <w:t xml:space="preserve">говорить</w:t>
+            </w:r>
+          </w:p>
+        </w:tc>
+        <w:tc>
+          <w:tcPr>
+            <w:tcW w:type="dxa" w:w="4338"/>
+            <w:tcBorders>
+              <w:top w:val="single" w:color="999999" w:sz="4"/>
+              <w:left w:val="single" w:color="999999" w:sz="4"/>
+              <w:bottom w:val="single" w:color="999999" w:sz="4"/>
+              <w:right w:val="single" w:color="999999" w:sz="4"/>
+            </w:tcBorders>
+            <w:tcMar>
+              <w:top w:type="dxa" w:w="80"/>
+              <w:left w:type="dxa" w:w="100"/>
+              <w:bottom w:type="dxa" w:w="80"/>
+              <w:right w:type="dxa" w:w="100"/>
+            </w:tcMar>
+          </w:tcPr>
+          <w:p>
+            <w:pPr>
+              <w:spacing w:after="0" w:before="0"/>
+            </w:pPr>
+            <w:r>
+              <w:rPr>
+                <w:rFonts w:ascii="Arial" w:cs="Arial" w:eastAsia="Arial" w:hAnsi="Arial"/>
+                <w:b w:val="false"/>
+                <w:bCs w:val="false"/>
+                <w:sz w:val="22"/>
+                <w:szCs w:val="22"/>
+              </w:rPr>
+              <w:t xml:space="preserve">Ich spreche Deutsch. (du sprichst, er spricht — подробно в день 9)</w:t>
+            </w:r>
+          </w:p>
+        </w:tc>
+      </w:tr>
+      <w:tr>
+        <w:trPr>
+          <w:tblHeader w:val="false"/>
+        </w:trPr>
+        <w:tc>
+          <w:tcPr>
+            <w:tcW w:type="dxa" w:w="2900"/>
+            <w:tcBorders>
+              <w:top w:val="single" w:color="999999" w:sz="4"/>
+              <w:left w:val="single" w:color="999999" w:sz="4"/>
+              <w:bottom w:val="single" w:color="999999" w:sz="4"/>
+              <w:right w:val="single" w:color="999999" w:sz="4"/>
+            </w:tcBorders>
+            <w:shd w:fill="F7F7F7" w:color="auto" w:val="clear"/>
+            <w:tcMar>
+              <w:top w:type="dxa" w:w="80"/>
+              <w:left w:type="dxa" w:w="100"/>
+              <w:bottom w:type="dxa" w:w="80"/>
+              <w:right w:type="dxa" w:w="100"/>
+            </w:tcMar>
+          </w:tcPr>
+          <w:p>
+            <w:pPr>
+              <w:spacing w:after="0" w:before="0"/>
+            </w:pPr>
+            <w:r>
+              <w:rPr>
+                <w:rFonts w:ascii="Arial" w:cs="Arial" w:eastAsia="Arial" w:hAnsi="Arial"/>
+                <w:b/>
+                <w:bCs/>
+                <w:sz w:val="22"/>
+                <w:szCs w:val="22"/>
+              </w:rPr>
+              <w:t xml:space="preserve">lernen</w:t>
+            </w:r>
+          </w:p>
+        </w:tc>
+        <w:tc>
+          <w:tcPr>
+            <w:tcW w:type="dxa" w:w="2400"/>
+            <w:tcBorders>
+              <w:top w:val="single" w:color="999999" w:sz="4"/>
+              <w:left w:val="single" w:color="999999" w:sz="4"/>
+              <w:bottom w:val="single" w:color="999999" w:sz="4"/>
+              <w:right w:val="single" w:color="999999" w:sz="4"/>
+            </w:tcBorders>
+            <w:tcMar>
+              <w:top w:type="dxa" w:w="80"/>
+              <w:left w:type="dxa" w:w="100"/>
+              <w:bottom w:type="dxa" w:w="80"/>
+              <w:right w:type="dxa" w:w="100"/>
+            </w:tcMar>
+          </w:tcPr>
+          <w:p>
+            <w:pPr>
+              <w:spacing w:after="0" w:before="0"/>
+            </w:pPr>
+            <w:r>
+              <w:rPr>
+                <w:rFonts w:ascii="Arial" w:cs="Arial" w:eastAsia="Arial" w:hAnsi="Arial"/>
+                <w:b w:val="false"/>
+                <w:bCs w:val="false"/>
+                <w:sz w:val="22"/>
+                <w:szCs w:val="22"/>
+              </w:rPr>
+              <w:t xml:space="preserve">учить, изучать</w:t>
+            </w:r>
+          </w:p>
+        </w:tc>
+        <w:tc>
+          <w:tcPr>
+            <w:tcW w:type="dxa" w:w="4338"/>
+            <w:tcBorders>
+              <w:top w:val="single" w:color="999999" w:sz="4"/>
+              <w:left w:val="single" w:color="999999" w:sz="4"/>
+              <w:bottom w:val="single" w:color="999999" w:sz="4"/>
+              <w:right w:val="single" w:color="999999" w:sz="4"/>
+            </w:tcBorders>
+            <w:tcMar>
+              <w:top w:type="dxa" w:w="80"/>
+              <w:left w:type="dxa" w:w="100"/>
+              <w:bottom w:type="dxa" w:w="80"/>
+              <w:right w:type="dxa" w:w="100"/>
+            </w:tcMar>
+          </w:tcPr>
+          <w:p>
+            <w:pPr>
+              <w:spacing w:after="0" w:before="0"/>
+            </w:pPr>
+            <w:r>
+              <w:rPr>
+                <w:rFonts w:ascii="Arial" w:cs="Arial" w:eastAsia="Arial" w:hAnsi="Arial"/>
+                <w:b w:val="false"/>
+                <w:bCs w:val="false"/>
+                <w:sz w:val="22"/>
+                <w:szCs w:val="22"/>
+              </w:rPr>
+              <w:t xml:space="preserve">Ich lerne Deutsch.</w:t>
+            </w:r>
+          </w:p>
+        </w:tc>
+      </w:tr>
+      <w:tr>
+        <w:trPr>
+          <w:tblHeader w:val="false"/>
+        </w:trPr>
+        <w:tc>
+          <w:tcPr>
+            <w:tcW w:type="dxa" w:w="2900"/>
+            <w:tcBorders>
+              <w:top w:val="single" w:color="999999" w:sz="4"/>
+              <w:left w:val="single" w:color="999999" w:sz="4"/>
+              <w:bottom w:val="single" w:color="999999" w:sz="4"/>
+              <w:right w:val="single" w:color="999999" w:sz="4"/>
+            </w:tcBorders>
+            <w:shd w:fill="F7F7F7" w:color="auto" w:val="clear"/>
+            <w:tcMar>
+              <w:top w:type="dxa" w:w="80"/>
+              <w:left w:type="dxa" w:w="100"/>
+              <w:bottom w:type="dxa" w:w="80"/>
+              <w:right w:type="dxa" w:w="100"/>
+            </w:tcMar>
+          </w:tcPr>
+          <w:p>
+            <w:pPr>
+              <w:spacing w:after="0" w:before="0"/>
+            </w:pPr>
+            <w:r>
+              <w:rPr>
+                <w:rFonts w:ascii="Arial" w:cs="Arial" w:eastAsia="Arial" w:hAnsi="Arial"/>
+                <w:b/>
+                <w:bCs/>
+                <w:sz w:val="22"/>
+                <w:szCs w:val="22"/>
+              </w:rPr>
+              <w:t xml:space="preserve">arbeiten</w:t>
+            </w:r>
+          </w:p>
+        </w:tc>
+        <w:tc>
+          <w:tcPr>
+            <w:tcW w:type="dxa" w:w="2400"/>
+            <w:tcBorders>
+              <w:top w:val="single" w:color="999999" w:sz="4"/>
+              <w:left w:val="single" w:color="999999" w:sz="4"/>
+              <w:bottom w:val="single" w:color="999999" w:sz="4"/>
+              <w:right w:val="single" w:color="999999" w:sz="4"/>
+            </w:tcBorders>
+            <w:tcMar>
+              <w:top w:type="dxa" w:w="80"/>
+              <w:left w:type="dxa" w:w="100"/>
+              <w:bottom w:type="dxa" w:w="80"/>
+              <w:right w:type="dxa" w:w="100"/>
+            </w:tcMar>
+          </w:tcPr>
+          <w:p>
+            <w:pPr>
+              <w:spacing w:after="0" w:before="0"/>
+            </w:pPr>
+            <w:r>
+              <w:rPr>
+                <w:rFonts w:ascii="Arial" w:cs="Arial" w:eastAsia="Arial" w:hAnsi="Arial"/>
+                <w:b w:val="false"/>
+                <w:bCs w:val="false"/>
+                <w:sz w:val="22"/>
+                <w:szCs w:val="22"/>
+              </w:rPr>
+              <w:t xml:space="preserve">работать</w:t>
+            </w:r>
+          </w:p>
+        </w:tc>
+        <w:tc>
+          <w:tcPr>
+            <w:tcW w:type="dxa" w:w="4338"/>
+            <w:tcBorders>
+              <w:top w:val="single" w:color="999999" w:sz="4"/>
+              <w:left w:val="single" w:color="999999" w:sz="4"/>
+              <w:bottom w:val="single" w:color="999999" w:sz="4"/>
+              <w:right w:val="single" w:color="999999" w:sz="4"/>
+            </w:tcBorders>
+            <w:tcMar>
+              <w:top w:type="dxa" w:w="80"/>
+              <w:left w:type="dxa" w:w="100"/>
+              <w:bottom w:type="dxa" w:w="80"/>
+              <w:right w:type="dxa" w:w="100"/>
+            </w:tcMar>
+          </w:tcPr>
+          <w:p>
+            <w:pPr>
+              <w:spacing w:after="0" w:before="0"/>
+            </w:pPr>
+            <w:r>
+              <w:rPr>
+                <w:rFonts w:ascii="Arial" w:cs="Arial" w:eastAsia="Arial" w:hAnsi="Arial"/>
+                <w:b w:val="false"/>
+                <w:bCs w:val="false"/>
+                <w:sz w:val="22"/>
+                <w:szCs w:val="22"/>
+              </w:rPr>
+              <w:t xml:space="preserve">Er arbeitet in Wien.</w:t>
+            </w:r>
+          </w:p>
+        </w:tc>
+      </w:tr>
+      <w:tr>
+        <w:trPr>
+          <w:tblHeader w:val="false"/>
+        </w:trPr>
+        <w:tc>
+          <w:tcPr>
+            <w:tcW w:type="dxa" w:w="2900"/>
+            <w:tcBorders>
+              <w:top w:val="single" w:color="999999" w:sz="4"/>
+              <w:left w:val="single" w:color="999999" w:sz="4"/>
+              <w:bottom w:val="single" w:color="999999" w:sz="4"/>
+              <w:right w:val="single" w:color="999999" w:sz="4"/>
+            </w:tcBorders>
+            <w:shd w:fill="F7F7F7" w:color="auto" w:val="clear"/>
+            <w:tcMar>
+              <w:top w:type="dxa" w:w="80"/>
+              <w:left w:type="dxa" w:w="100"/>
+              <w:bottom w:type="dxa" w:w="80"/>
+              <w:right w:type="dxa" w:w="100"/>
+            </w:tcMar>
+          </w:tcPr>
+          <w:p>
+            <w:pPr>
+              <w:spacing w:after="0" w:before="0"/>
+            </w:pPr>
+            <w:r>
+              <w:rPr>
+                <w:rFonts w:ascii="Arial" w:cs="Arial" w:eastAsia="Arial" w:hAnsi="Arial"/>
+                <w:b/>
+                <w:bCs/>
+                <w:sz w:val="22"/>
+                <w:szCs w:val="22"/>
+              </w:rPr>
+              <w:t xml:space="preserve">machen</w:t>
+            </w:r>
+          </w:p>
+        </w:tc>
+        <w:tc>
+          <w:tcPr>
+            <w:tcW w:type="dxa" w:w="2400"/>
+            <w:tcBorders>
+              <w:top w:val="single" w:color="999999" w:sz="4"/>
+              <w:left w:val="single" w:color="999999" w:sz="4"/>
+              <w:bottom w:val="single" w:color="999999" w:sz="4"/>
+              <w:right w:val="single" w:color="999999" w:sz="4"/>
+            </w:tcBorders>
+            <w:tcMar>
+              <w:top w:type="dxa" w:w="80"/>
+              <w:left w:type="dxa" w:w="100"/>
+              <w:bottom w:type="dxa" w:w="80"/>
+              <w:right w:type="dxa" w:w="100"/>
+            </w:tcMar>
+          </w:tcPr>
+          <w:p>
+            <w:pPr>
+              <w:spacing w:after="0" w:before="0"/>
+            </w:pPr>
+            <w:r>
+              <w:rPr>
+                <w:rFonts w:ascii="Arial" w:cs="Arial" w:eastAsia="Arial" w:hAnsi="Arial"/>
+                <w:b w:val="false"/>
+                <w:bCs w:val="false"/>
+                <w:sz w:val="22"/>
+                <w:szCs w:val="22"/>
+              </w:rPr>
+              <w:t xml:space="preserve">делать</w:t>
+            </w:r>
+          </w:p>
+        </w:tc>
+        <w:tc>
+          <w:tcPr>
+            <w:tcW w:type="dxa" w:w="4338"/>
+            <w:tcBorders>
+              <w:top w:val="single" w:color="999999" w:sz="4"/>
+              <w:left w:val="single" w:color="999999" w:sz="4"/>
+              <w:bottom w:val="single" w:color="999999" w:sz="4"/>
+              <w:right w:val="single" w:color="999999" w:sz="4"/>
+            </w:tcBorders>
+            <w:tcMar>
+              <w:top w:type="dxa" w:w="80"/>
+              <w:left w:type="dxa" w:w="100"/>
+              <w:bottom w:type="dxa" w:w="80"/>
+              <w:right w:type="dxa" w:w="100"/>
+            </w:tcMar>
+          </w:tcPr>
+          <w:p>
+            <w:pPr>
+              <w:spacing w:after="0" w:before="0"/>
+            </w:pPr>
+            <w:r>
+              <w:rPr>
+                <w:rFonts w:ascii="Arial" w:cs="Arial" w:eastAsia="Arial" w:hAnsi="Arial"/>
+                <w:b w:val="false"/>
+                <w:bCs w:val="false"/>
+                <w:sz w:val="22"/>
+                <w:szCs w:val="22"/>
+              </w:rPr>
+              <w:t xml:space="preserve">Was machst du?</w:t>
+            </w:r>
+          </w:p>
+        </w:tc>
+      </w:tr>
+    </w:tbl>
+    <w:p>
+      <w:pPr>
+        <w:spacing w:after="120" w:before="120"/>
+      </w:pPr>
+      <w:r>
+        <w:rPr>
+          <w:rFonts w:ascii="Arial" w:cs="Arial" w:eastAsia="Arial" w:hAnsi="Arial"/>
+          <w:i/>
+          <w:iCs/>
+          <w:sz w:val="22"/>
+          <w:szCs w:val="22"/>
+        </w:rPr>
+        <w:t xml:space="preserve">Приём: к каждому слову скажите вслух предложение про себя, а не только перевод.</w:t>
       </w:r>
     </w:p>
     <w:p>

</xml_diff>